<commit_message>
style(doc-forge): McKinsey horizontal-rule table style for DOCX and PDF
Replace full-border/shaded table style with consulting-style horizontal
rules only: thick top + thin bottom on header row, thin bottom on last
row, no vertical borders, no background colors. DOCX uses new
_set_cell_borders() API with border_mode config; PDF updates default.css
to match.

Co-Authored-By: Claude Sonnet 4.6 <noreply@anthropic.com>
</commit_message>
<xml_diff>
--- a/skills/writing/doc-forge/tests/fixtures/full-test.docx
+++ b/skills/writing/doc-forge/tests/fixtures/full-test.docx
@@ -902,12 +902,11 @@
           <w:tcPr>
             <w:tcW w:type="dxa" w:w="2882"/>
             <w:tcBorders>
-              <w:top w:val="single" w:sz="4" w:color="AAAAAA"/>
-              <w:left w:val="single" w:sz="4" w:color="AAAAAA"/>
-              <w:bottom w:val="single" w:sz="4" w:color="AAAAAA"/>
-              <w:right w:val="single" w:sz="4" w:color="AAAAAA"/>
+              <w:top w:val="single" w:sz="12" w:color="000000"/>
+              <w:bottom w:val="single" w:sz="6" w:color="000000"/>
+              <w:left w:val="nil"/>
+              <w:right w:val="nil"/>
             </w:tcBorders>
-            <w:shd w:val="clear" w:color="auto" w:fill="D9E1F2"/>
           </w:tcPr>
           <w:p>
             <w:pPr>
@@ -929,12 +928,11 @@
           <w:tcPr>
             <w:tcW w:type="dxa" w:w="2882"/>
             <w:tcBorders>
-              <w:top w:val="single" w:sz="4" w:color="AAAAAA"/>
-              <w:left w:val="single" w:sz="4" w:color="AAAAAA"/>
-              <w:bottom w:val="single" w:sz="4" w:color="AAAAAA"/>
-              <w:right w:val="single" w:sz="4" w:color="AAAAAA"/>
+              <w:top w:val="single" w:sz="12" w:color="000000"/>
+              <w:bottom w:val="single" w:sz="6" w:color="000000"/>
+              <w:left w:val="nil"/>
+              <w:right w:val="nil"/>
             </w:tcBorders>
-            <w:shd w:val="clear" w:color="auto" w:fill="D9E1F2"/>
           </w:tcPr>
           <w:p>
             <w:pPr>
@@ -956,12 +954,11 @@
           <w:tcPr>
             <w:tcW w:type="dxa" w:w="2882"/>
             <w:tcBorders>
-              <w:top w:val="single" w:sz="4" w:color="AAAAAA"/>
-              <w:left w:val="single" w:sz="4" w:color="AAAAAA"/>
-              <w:bottom w:val="single" w:sz="4" w:color="AAAAAA"/>
-              <w:right w:val="single" w:sz="4" w:color="AAAAAA"/>
+              <w:top w:val="single" w:sz="12" w:color="000000"/>
+              <w:bottom w:val="single" w:sz="6" w:color="000000"/>
+              <w:left w:val="nil"/>
+              <w:right w:val="nil"/>
             </w:tcBorders>
-            <w:shd w:val="clear" w:color="auto" w:fill="D9E1F2"/>
           </w:tcPr>
           <w:p>
             <w:pPr>
@@ -985,10 +982,10 @@
           <w:tcPr>
             <w:tcW w:type="dxa" w:w="2882"/>
             <w:tcBorders>
-              <w:top w:val="single" w:sz="4" w:color="AAAAAA"/>
-              <w:left w:val="single" w:sz="4" w:color="AAAAAA"/>
-              <w:bottom w:val="single" w:sz="4" w:color="AAAAAA"/>
-              <w:right w:val="single" w:sz="4" w:color="AAAAAA"/>
+              <w:top w:val="nil"/>
+              <w:bottom w:val="nil"/>
+              <w:left w:val="nil"/>
+              <w:right w:val="nil"/>
             </w:tcBorders>
           </w:tcPr>
           <w:p>
@@ -1011,10 +1008,10 @@
           <w:tcPr>
             <w:tcW w:type="dxa" w:w="2882"/>
             <w:tcBorders>
-              <w:top w:val="single" w:sz="4" w:color="AAAAAA"/>
-              <w:left w:val="single" w:sz="4" w:color="AAAAAA"/>
-              <w:bottom w:val="single" w:sz="4" w:color="AAAAAA"/>
-              <w:right w:val="single" w:sz="4" w:color="AAAAAA"/>
+              <w:top w:val="nil"/>
+              <w:bottom w:val="nil"/>
+              <w:left w:val="nil"/>
+              <w:right w:val="nil"/>
             </w:tcBorders>
           </w:tcPr>
           <w:p>
@@ -1037,10 +1034,10 @@
           <w:tcPr>
             <w:tcW w:type="dxa" w:w="2882"/>
             <w:tcBorders>
-              <w:top w:val="single" w:sz="4" w:color="AAAAAA"/>
-              <w:left w:val="single" w:sz="4" w:color="AAAAAA"/>
-              <w:bottom w:val="single" w:sz="4" w:color="AAAAAA"/>
-              <w:right w:val="single" w:sz="4" w:color="AAAAAA"/>
+              <w:top w:val="nil"/>
+              <w:bottom w:val="nil"/>
+              <w:left w:val="nil"/>
+              <w:right w:val="nil"/>
             </w:tcBorders>
           </w:tcPr>
           <w:p>
@@ -1065,10 +1062,10 @@
           <w:tcPr>
             <w:tcW w:type="dxa" w:w="2882"/>
             <w:tcBorders>
-              <w:top w:val="single" w:sz="4" w:color="AAAAAA"/>
-              <w:left w:val="single" w:sz="4" w:color="AAAAAA"/>
-              <w:bottom w:val="single" w:sz="4" w:color="AAAAAA"/>
-              <w:right w:val="single" w:sz="4" w:color="AAAAAA"/>
+              <w:top w:val="nil"/>
+              <w:bottom w:val="nil"/>
+              <w:left w:val="nil"/>
+              <w:right w:val="nil"/>
             </w:tcBorders>
           </w:tcPr>
           <w:p>
@@ -1091,10 +1088,10 @@
           <w:tcPr>
             <w:tcW w:type="dxa" w:w="2882"/>
             <w:tcBorders>
-              <w:top w:val="single" w:sz="4" w:color="AAAAAA"/>
-              <w:left w:val="single" w:sz="4" w:color="AAAAAA"/>
-              <w:bottom w:val="single" w:sz="4" w:color="AAAAAA"/>
-              <w:right w:val="single" w:sz="4" w:color="AAAAAA"/>
+              <w:top w:val="nil"/>
+              <w:bottom w:val="nil"/>
+              <w:left w:val="nil"/>
+              <w:right w:val="nil"/>
             </w:tcBorders>
           </w:tcPr>
           <w:p>
@@ -1117,10 +1114,10 @@
           <w:tcPr>
             <w:tcW w:type="dxa" w:w="2882"/>
             <w:tcBorders>
-              <w:top w:val="single" w:sz="4" w:color="AAAAAA"/>
-              <w:left w:val="single" w:sz="4" w:color="AAAAAA"/>
-              <w:bottom w:val="single" w:sz="4" w:color="AAAAAA"/>
-              <w:right w:val="single" w:sz="4" w:color="AAAAAA"/>
+              <w:top w:val="nil"/>
+              <w:bottom w:val="nil"/>
+              <w:left w:val="nil"/>
+              <w:right w:val="nil"/>
             </w:tcBorders>
           </w:tcPr>
           <w:p>
@@ -1145,10 +1142,10 @@
           <w:tcPr>
             <w:tcW w:type="dxa" w:w="2882"/>
             <w:tcBorders>
-              <w:top w:val="single" w:sz="4" w:color="AAAAAA"/>
-              <w:left w:val="single" w:sz="4" w:color="AAAAAA"/>
-              <w:bottom w:val="single" w:sz="4" w:color="AAAAAA"/>
-              <w:right w:val="single" w:sz="4" w:color="AAAAAA"/>
+              <w:top w:val="nil"/>
+              <w:bottom w:val="nil"/>
+              <w:left w:val="nil"/>
+              <w:right w:val="nil"/>
             </w:tcBorders>
           </w:tcPr>
           <w:p>
@@ -1171,10 +1168,10 @@
           <w:tcPr>
             <w:tcW w:type="dxa" w:w="2882"/>
             <w:tcBorders>
-              <w:top w:val="single" w:sz="4" w:color="AAAAAA"/>
-              <w:left w:val="single" w:sz="4" w:color="AAAAAA"/>
-              <w:bottom w:val="single" w:sz="4" w:color="AAAAAA"/>
-              <w:right w:val="single" w:sz="4" w:color="AAAAAA"/>
+              <w:top w:val="nil"/>
+              <w:bottom w:val="nil"/>
+              <w:left w:val="nil"/>
+              <w:right w:val="nil"/>
             </w:tcBorders>
           </w:tcPr>
           <w:p>
@@ -1197,10 +1194,10 @@
           <w:tcPr>
             <w:tcW w:type="dxa" w:w="2882"/>
             <w:tcBorders>
-              <w:top w:val="single" w:sz="4" w:color="AAAAAA"/>
-              <w:left w:val="single" w:sz="4" w:color="AAAAAA"/>
-              <w:bottom w:val="single" w:sz="4" w:color="AAAAAA"/>
-              <w:right w:val="single" w:sz="4" w:color="AAAAAA"/>
+              <w:top w:val="nil"/>
+              <w:bottom w:val="nil"/>
+              <w:left w:val="nil"/>
+              <w:right w:val="nil"/>
             </w:tcBorders>
           </w:tcPr>
           <w:p>
@@ -1225,10 +1222,10 @@
           <w:tcPr>
             <w:tcW w:type="dxa" w:w="2882"/>
             <w:tcBorders>
-              <w:top w:val="single" w:sz="4" w:color="AAAAAA"/>
-              <w:left w:val="single" w:sz="4" w:color="AAAAAA"/>
-              <w:bottom w:val="single" w:sz="4" w:color="AAAAAA"/>
-              <w:right w:val="single" w:sz="4" w:color="AAAAAA"/>
+              <w:top w:val="nil"/>
+              <w:bottom w:val="nil"/>
+              <w:left w:val="nil"/>
+              <w:right w:val="nil"/>
             </w:tcBorders>
           </w:tcPr>
           <w:p>
@@ -1251,10 +1248,10 @@
           <w:tcPr>
             <w:tcW w:type="dxa" w:w="2882"/>
             <w:tcBorders>
-              <w:top w:val="single" w:sz="4" w:color="AAAAAA"/>
-              <w:left w:val="single" w:sz="4" w:color="AAAAAA"/>
-              <w:bottom w:val="single" w:sz="4" w:color="AAAAAA"/>
-              <w:right w:val="single" w:sz="4" w:color="AAAAAA"/>
+              <w:top w:val="nil"/>
+              <w:bottom w:val="nil"/>
+              <w:left w:val="nil"/>
+              <w:right w:val="nil"/>
             </w:tcBorders>
           </w:tcPr>
           <w:p>
@@ -1277,10 +1274,10 @@
           <w:tcPr>
             <w:tcW w:type="dxa" w:w="2882"/>
             <w:tcBorders>
-              <w:top w:val="single" w:sz="4" w:color="AAAAAA"/>
-              <w:left w:val="single" w:sz="4" w:color="AAAAAA"/>
-              <w:bottom w:val="single" w:sz="4" w:color="AAAAAA"/>
-              <w:right w:val="single" w:sz="4" w:color="AAAAAA"/>
+              <w:top w:val="nil"/>
+              <w:bottom w:val="nil"/>
+              <w:left w:val="nil"/>
+              <w:right w:val="nil"/>
             </w:tcBorders>
           </w:tcPr>
           <w:p>
@@ -1305,10 +1302,10 @@
           <w:tcPr>
             <w:tcW w:type="dxa" w:w="2882"/>
             <w:tcBorders>
-              <w:top w:val="single" w:sz="4" w:color="AAAAAA"/>
-              <w:left w:val="single" w:sz="4" w:color="AAAAAA"/>
-              <w:bottom w:val="single" w:sz="4" w:color="AAAAAA"/>
-              <w:right w:val="single" w:sz="4" w:color="AAAAAA"/>
+              <w:top w:val="nil"/>
+              <w:bottom w:val="nil"/>
+              <w:left w:val="nil"/>
+              <w:right w:val="nil"/>
             </w:tcBorders>
           </w:tcPr>
           <w:p>
@@ -1331,10 +1328,10 @@
           <w:tcPr>
             <w:tcW w:type="dxa" w:w="2882"/>
             <w:tcBorders>
-              <w:top w:val="single" w:sz="4" w:color="AAAAAA"/>
-              <w:left w:val="single" w:sz="4" w:color="AAAAAA"/>
-              <w:bottom w:val="single" w:sz="4" w:color="AAAAAA"/>
-              <w:right w:val="single" w:sz="4" w:color="AAAAAA"/>
+              <w:top w:val="nil"/>
+              <w:bottom w:val="nil"/>
+              <w:left w:val="nil"/>
+              <w:right w:val="nil"/>
             </w:tcBorders>
           </w:tcPr>
           <w:p>
@@ -1357,10 +1354,10 @@
           <w:tcPr>
             <w:tcW w:type="dxa" w:w="2882"/>
             <w:tcBorders>
-              <w:top w:val="single" w:sz="4" w:color="AAAAAA"/>
-              <w:left w:val="single" w:sz="4" w:color="AAAAAA"/>
-              <w:bottom w:val="single" w:sz="4" w:color="AAAAAA"/>
-              <w:right w:val="single" w:sz="4" w:color="AAAAAA"/>
+              <w:top w:val="nil"/>
+              <w:bottom w:val="nil"/>
+              <w:left w:val="nil"/>
+              <w:right w:val="nil"/>
             </w:tcBorders>
           </w:tcPr>
           <w:p>
@@ -1385,10 +1382,10 @@
           <w:tcPr>
             <w:tcW w:type="dxa" w:w="2882"/>
             <w:tcBorders>
-              <w:top w:val="single" w:sz="4" w:color="AAAAAA"/>
-              <w:left w:val="single" w:sz="4" w:color="AAAAAA"/>
-              <w:bottom w:val="single" w:sz="4" w:color="AAAAAA"/>
-              <w:right w:val="single" w:sz="4" w:color="AAAAAA"/>
+              <w:top w:val="nil"/>
+              <w:bottom w:val="nil"/>
+              <w:left w:val="nil"/>
+              <w:right w:val="nil"/>
             </w:tcBorders>
           </w:tcPr>
           <w:p>
@@ -1411,10 +1408,10 @@
           <w:tcPr>
             <w:tcW w:type="dxa" w:w="2882"/>
             <w:tcBorders>
-              <w:top w:val="single" w:sz="4" w:color="AAAAAA"/>
-              <w:left w:val="single" w:sz="4" w:color="AAAAAA"/>
-              <w:bottom w:val="single" w:sz="4" w:color="AAAAAA"/>
-              <w:right w:val="single" w:sz="4" w:color="AAAAAA"/>
+              <w:top w:val="nil"/>
+              <w:bottom w:val="nil"/>
+              <w:left w:val="nil"/>
+              <w:right w:val="nil"/>
             </w:tcBorders>
           </w:tcPr>
           <w:p>
@@ -1437,10 +1434,10 @@
           <w:tcPr>
             <w:tcW w:type="dxa" w:w="2882"/>
             <w:tcBorders>
-              <w:top w:val="single" w:sz="4" w:color="AAAAAA"/>
-              <w:left w:val="single" w:sz="4" w:color="AAAAAA"/>
-              <w:bottom w:val="single" w:sz="4" w:color="AAAAAA"/>
-              <w:right w:val="single" w:sz="4" w:color="AAAAAA"/>
+              <w:top w:val="nil"/>
+              <w:bottom w:val="nil"/>
+              <w:left w:val="nil"/>
+              <w:right w:val="nil"/>
             </w:tcBorders>
           </w:tcPr>
           <w:p>
@@ -1465,10 +1462,10 @@
           <w:tcPr>
             <w:tcW w:type="dxa" w:w="2882"/>
             <w:tcBorders>
-              <w:top w:val="single" w:sz="4" w:color="AAAAAA"/>
-              <w:left w:val="single" w:sz="4" w:color="AAAAAA"/>
-              <w:bottom w:val="single" w:sz="4" w:color="AAAAAA"/>
-              <w:right w:val="single" w:sz="4" w:color="AAAAAA"/>
+              <w:top w:val="nil"/>
+              <w:bottom w:val="nil"/>
+              <w:left w:val="nil"/>
+              <w:right w:val="nil"/>
             </w:tcBorders>
           </w:tcPr>
           <w:p>
@@ -1491,10 +1488,10 @@
           <w:tcPr>
             <w:tcW w:type="dxa" w:w="2882"/>
             <w:tcBorders>
-              <w:top w:val="single" w:sz="4" w:color="AAAAAA"/>
-              <w:left w:val="single" w:sz="4" w:color="AAAAAA"/>
-              <w:bottom w:val="single" w:sz="4" w:color="AAAAAA"/>
-              <w:right w:val="single" w:sz="4" w:color="AAAAAA"/>
+              <w:top w:val="nil"/>
+              <w:bottom w:val="nil"/>
+              <w:left w:val="nil"/>
+              <w:right w:val="nil"/>
             </w:tcBorders>
           </w:tcPr>
           <w:p>
@@ -1517,10 +1514,10 @@
           <w:tcPr>
             <w:tcW w:type="dxa" w:w="2882"/>
             <w:tcBorders>
-              <w:top w:val="single" w:sz="4" w:color="AAAAAA"/>
-              <w:left w:val="single" w:sz="4" w:color="AAAAAA"/>
-              <w:bottom w:val="single" w:sz="4" w:color="AAAAAA"/>
-              <w:right w:val="single" w:sz="4" w:color="AAAAAA"/>
+              <w:top w:val="nil"/>
+              <w:bottom w:val="nil"/>
+              <w:left w:val="nil"/>
+              <w:right w:val="nil"/>
             </w:tcBorders>
           </w:tcPr>
           <w:p>
@@ -1545,10 +1542,10 @@
           <w:tcPr>
             <w:tcW w:type="dxa" w:w="2882"/>
             <w:tcBorders>
-              <w:top w:val="single" w:sz="4" w:color="AAAAAA"/>
-              <w:left w:val="single" w:sz="4" w:color="AAAAAA"/>
-              <w:bottom w:val="single" w:sz="4" w:color="AAAAAA"/>
-              <w:right w:val="single" w:sz="4" w:color="AAAAAA"/>
+              <w:top w:val="nil"/>
+              <w:bottom w:val="nil"/>
+              <w:left w:val="nil"/>
+              <w:right w:val="nil"/>
             </w:tcBorders>
           </w:tcPr>
           <w:p>
@@ -1571,10 +1568,10 @@
           <w:tcPr>
             <w:tcW w:type="dxa" w:w="2882"/>
             <w:tcBorders>
-              <w:top w:val="single" w:sz="4" w:color="AAAAAA"/>
-              <w:left w:val="single" w:sz="4" w:color="AAAAAA"/>
-              <w:bottom w:val="single" w:sz="4" w:color="AAAAAA"/>
-              <w:right w:val="single" w:sz="4" w:color="AAAAAA"/>
+              <w:top w:val="nil"/>
+              <w:bottom w:val="nil"/>
+              <w:left w:val="nil"/>
+              <w:right w:val="nil"/>
             </w:tcBorders>
           </w:tcPr>
           <w:p>
@@ -1597,10 +1594,10 @@
           <w:tcPr>
             <w:tcW w:type="dxa" w:w="2882"/>
             <w:tcBorders>
-              <w:top w:val="single" w:sz="4" w:color="AAAAAA"/>
-              <w:left w:val="single" w:sz="4" w:color="AAAAAA"/>
-              <w:bottom w:val="single" w:sz="4" w:color="AAAAAA"/>
-              <w:right w:val="single" w:sz="4" w:color="AAAAAA"/>
+              <w:top w:val="nil"/>
+              <w:bottom w:val="nil"/>
+              <w:left w:val="nil"/>
+              <w:right w:val="nil"/>
             </w:tcBorders>
           </w:tcPr>
           <w:p>
@@ -1625,10 +1622,10 @@
           <w:tcPr>
             <w:tcW w:type="dxa" w:w="2882"/>
             <w:tcBorders>
-              <w:top w:val="single" w:sz="4" w:color="AAAAAA"/>
-              <w:left w:val="single" w:sz="4" w:color="AAAAAA"/>
-              <w:bottom w:val="single" w:sz="4" w:color="AAAAAA"/>
-              <w:right w:val="single" w:sz="4" w:color="AAAAAA"/>
+              <w:top w:val="nil"/>
+              <w:bottom w:val="nil"/>
+              <w:left w:val="nil"/>
+              <w:right w:val="nil"/>
             </w:tcBorders>
           </w:tcPr>
           <w:p>
@@ -1651,10 +1648,10 @@
           <w:tcPr>
             <w:tcW w:type="dxa" w:w="2882"/>
             <w:tcBorders>
-              <w:top w:val="single" w:sz="4" w:color="AAAAAA"/>
-              <w:left w:val="single" w:sz="4" w:color="AAAAAA"/>
-              <w:bottom w:val="single" w:sz="4" w:color="AAAAAA"/>
-              <w:right w:val="single" w:sz="4" w:color="AAAAAA"/>
+              <w:top w:val="nil"/>
+              <w:bottom w:val="nil"/>
+              <w:left w:val="nil"/>
+              <w:right w:val="nil"/>
             </w:tcBorders>
           </w:tcPr>
           <w:p>
@@ -1677,10 +1674,10 @@
           <w:tcPr>
             <w:tcW w:type="dxa" w:w="2882"/>
             <w:tcBorders>
-              <w:top w:val="single" w:sz="4" w:color="AAAAAA"/>
-              <w:left w:val="single" w:sz="4" w:color="AAAAAA"/>
-              <w:bottom w:val="single" w:sz="4" w:color="AAAAAA"/>
-              <w:right w:val="single" w:sz="4" w:color="AAAAAA"/>
+              <w:top w:val="nil"/>
+              <w:bottom w:val="nil"/>
+              <w:left w:val="nil"/>
+              <w:right w:val="nil"/>
             </w:tcBorders>
           </w:tcPr>
           <w:p>
@@ -1705,10 +1702,10 @@
           <w:tcPr>
             <w:tcW w:type="dxa" w:w="2882"/>
             <w:tcBorders>
-              <w:top w:val="single" w:sz="4" w:color="AAAAAA"/>
-              <w:left w:val="single" w:sz="4" w:color="AAAAAA"/>
-              <w:bottom w:val="single" w:sz="4" w:color="AAAAAA"/>
-              <w:right w:val="single" w:sz="4" w:color="AAAAAA"/>
+              <w:top w:val="nil"/>
+              <w:bottom w:val="nil"/>
+              <w:left w:val="nil"/>
+              <w:right w:val="nil"/>
             </w:tcBorders>
           </w:tcPr>
           <w:p>
@@ -1731,10 +1728,10 @@
           <w:tcPr>
             <w:tcW w:type="dxa" w:w="2882"/>
             <w:tcBorders>
-              <w:top w:val="single" w:sz="4" w:color="AAAAAA"/>
-              <w:left w:val="single" w:sz="4" w:color="AAAAAA"/>
-              <w:bottom w:val="single" w:sz="4" w:color="AAAAAA"/>
-              <w:right w:val="single" w:sz="4" w:color="AAAAAA"/>
+              <w:top w:val="nil"/>
+              <w:bottom w:val="nil"/>
+              <w:left w:val="nil"/>
+              <w:right w:val="nil"/>
             </w:tcBorders>
           </w:tcPr>
           <w:p>
@@ -1757,10 +1754,10 @@
           <w:tcPr>
             <w:tcW w:type="dxa" w:w="2882"/>
             <w:tcBorders>
-              <w:top w:val="single" w:sz="4" w:color="AAAAAA"/>
-              <w:left w:val="single" w:sz="4" w:color="AAAAAA"/>
-              <w:bottom w:val="single" w:sz="4" w:color="AAAAAA"/>
-              <w:right w:val="single" w:sz="4" w:color="AAAAAA"/>
+              <w:top w:val="nil"/>
+              <w:bottom w:val="nil"/>
+              <w:left w:val="nil"/>
+              <w:right w:val="nil"/>
             </w:tcBorders>
           </w:tcPr>
           <w:p>
@@ -1785,10 +1782,10 @@
           <w:tcPr>
             <w:tcW w:type="dxa" w:w="2882"/>
             <w:tcBorders>
-              <w:top w:val="single" w:sz="4" w:color="AAAAAA"/>
-              <w:left w:val="single" w:sz="4" w:color="AAAAAA"/>
-              <w:bottom w:val="single" w:sz="4" w:color="AAAAAA"/>
-              <w:right w:val="single" w:sz="4" w:color="AAAAAA"/>
+              <w:top w:val="nil"/>
+              <w:bottom w:val="nil"/>
+              <w:left w:val="nil"/>
+              <w:right w:val="nil"/>
             </w:tcBorders>
           </w:tcPr>
           <w:p>
@@ -1811,10 +1808,10 @@
           <w:tcPr>
             <w:tcW w:type="dxa" w:w="2882"/>
             <w:tcBorders>
-              <w:top w:val="single" w:sz="4" w:color="AAAAAA"/>
-              <w:left w:val="single" w:sz="4" w:color="AAAAAA"/>
-              <w:bottom w:val="single" w:sz="4" w:color="AAAAAA"/>
-              <w:right w:val="single" w:sz="4" w:color="AAAAAA"/>
+              <w:top w:val="nil"/>
+              <w:bottom w:val="nil"/>
+              <w:left w:val="nil"/>
+              <w:right w:val="nil"/>
             </w:tcBorders>
           </w:tcPr>
           <w:p>
@@ -1837,10 +1834,10 @@
           <w:tcPr>
             <w:tcW w:type="dxa" w:w="2882"/>
             <w:tcBorders>
-              <w:top w:val="single" w:sz="4" w:color="AAAAAA"/>
-              <w:left w:val="single" w:sz="4" w:color="AAAAAA"/>
-              <w:bottom w:val="single" w:sz="4" w:color="AAAAAA"/>
-              <w:right w:val="single" w:sz="4" w:color="AAAAAA"/>
+              <w:top w:val="nil"/>
+              <w:bottom w:val="nil"/>
+              <w:left w:val="nil"/>
+              <w:right w:val="nil"/>
             </w:tcBorders>
           </w:tcPr>
           <w:p>
@@ -1865,10 +1862,10 @@
           <w:tcPr>
             <w:tcW w:type="dxa" w:w="2882"/>
             <w:tcBorders>
-              <w:top w:val="single" w:sz="4" w:color="AAAAAA"/>
-              <w:left w:val="single" w:sz="4" w:color="AAAAAA"/>
-              <w:bottom w:val="single" w:sz="4" w:color="AAAAAA"/>
-              <w:right w:val="single" w:sz="4" w:color="AAAAAA"/>
+              <w:top w:val="nil"/>
+              <w:bottom w:val="nil"/>
+              <w:left w:val="nil"/>
+              <w:right w:val="nil"/>
             </w:tcBorders>
           </w:tcPr>
           <w:p>
@@ -1891,10 +1888,10 @@
           <w:tcPr>
             <w:tcW w:type="dxa" w:w="2882"/>
             <w:tcBorders>
-              <w:top w:val="single" w:sz="4" w:color="AAAAAA"/>
-              <w:left w:val="single" w:sz="4" w:color="AAAAAA"/>
-              <w:bottom w:val="single" w:sz="4" w:color="AAAAAA"/>
-              <w:right w:val="single" w:sz="4" w:color="AAAAAA"/>
+              <w:top w:val="nil"/>
+              <w:bottom w:val="nil"/>
+              <w:left w:val="nil"/>
+              <w:right w:val="nil"/>
             </w:tcBorders>
           </w:tcPr>
           <w:p>
@@ -1909,7 +1906,7 @@
                 <w:i w:val="0"/>
                 <w:sz w:val="22"/>
               </w:rPr>
-              <w:t>❌</w:t>
+              <w:t>✅</w:t>
             </w:r>
           </w:p>
         </w:tc>
@@ -1917,10 +1914,10 @@
           <w:tcPr>
             <w:tcW w:type="dxa" w:w="2882"/>
             <w:tcBorders>
-              <w:top w:val="single" w:sz="4" w:color="AAAAAA"/>
-              <w:left w:val="single" w:sz="4" w:color="AAAAAA"/>
-              <w:bottom w:val="single" w:sz="4" w:color="AAAAAA"/>
-              <w:right w:val="single" w:sz="4" w:color="AAAAAA"/>
+              <w:top w:val="nil"/>
+              <w:bottom w:val="nil"/>
+              <w:left w:val="nil"/>
+              <w:right w:val="nil"/>
             </w:tcBorders>
           </w:tcPr>
           <w:p>
@@ -1945,10 +1942,10 @@
           <w:tcPr>
             <w:tcW w:type="dxa" w:w="2882"/>
             <w:tcBorders>
-              <w:top w:val="single" w:sz="4" w:color="AAAAAA"/>
-              <w:left w:val="single" w:sz="4" w:color="AAAAAA"/>
-              <w:bottom w:val="single" w:sz="4" w:color="AAAAAA"/>
-              <w:right w:val="single" w:sz="4" w:color="AAAAAA"/>
+              <w:top w:val="nil"/>
+              <w:bottom w:val="single" w:sz="6" w:color="000000"/>
+              <w:left w:val="nil"/>
+              <w:right w:val="nil"/>
             </w:tcBorders>
           </w:tcPr>
           <w:p>
@@ -1971,10 +1968,10 @@
           <w:tcPr>
             <w:tcW w:type="dxa" w:w="2882"/>
             <w:tcBorders>
-              <w:top w:val="single" w:sz="4" w:color="AAAAAA"/>
-              <w:left w:val="single" w:sz="4" w:color="AAAAAA"/>
-              <w:bottom w:val="single" w:sz="4" w:color="AAAAAA"/>
-              <w:right w:val="single" w:sz="4" w:color="AAAAAA"/>
+              <w:top w:val="nil"/>
+              <w:bottom w:val="single" w:sz="6" w:color="000000"/>
+              <w:left w:val="nil"/>
+              <w:right w:val="nil"/>
             </w:tcBorders>
           </w:tcPr>
           <w:p>
@@ -1997,10 +1994,10 @@
           <w:tcPr>
             <w:tcW w:type="dxa" w:w="2882"/>
             <w:tcBorders>
-              <w:top w:val="single" w:sz="4" w:color="AAAAAA"/>
-              <w:left w:val="single" w:sz="4" w:color="AAAAAA"/>
-              <w:bottom w:val="single" w:sz="4" w:color="AAAAAA"/>
-              <w:right w:val="single" w:sz="4" w:color="AAAAAA"/>
+              <w:top w:val="nil"/>
+              <w:bottom w:val="single" w:sz="6" w:color="000000"/>
+              <w:left w:val="nil"/>
+              <w:right w:val="nil"/>
             </w:tcBorders>
           </w:tcPr>
           <w:p>
@@ -2056,12 +2053,11 @@
           <w:tcPr>
             <w:tcW w:type="dxa" w:w="1729"/>
             <w:tcBorders>
-              <w:top w:val="single" w:sz="4" w:color="AAAAAA"/>
-              <w:left w:val="single" w:sz="4" w:color="AAAAAA"/>
-              <w:bottom w:val="single" w:sz="4" w:color="AAAAAA"/>
-              <w:right w:val="single" w:sz="4" w:color="AAAAAA"/>
+              <w:top w:val="single" w:sz="12" w:color="000000"/>
+              <w:bottom w:val="single" w:sz="6" w:color="000000"/>
+              <w:left w:val="nil"/>
+              <w:right w:val="nil"/>
             </w:tcBorders>
-            <w:shd w:val="clear" w:color="auto" w:fill="D9E1F2"/>
           </w:tcPr>
           <w:p>
             <w:pPr>
@@ -2083,12 +2079,11 @@
           <w:tcPr>
             <w:tcW w:type="dxa" w:w="1729"/>
             <w:tcBorders>
-              <w:top w:val="single" w:sz="4" w:color="AAAAAA"/>
-              <w:left w:val="single" w:sz="4" w:color="AAAAAA"/>
-              <w:bottom w:val="single" w:sz="4" w:color="AAAAAA"/>
-              <w:right w:val="single" w:sz="4" w:color="AAAAAA"/>
+              <w:top w:val="single" w:sz="12" w:color="000000"/>
+              <w:bottom w:val="single" w:sz="6" w:color="000000"/>
+              <w:left w:val="nil"/>
+              <w:right w:val="nil"/>
             </w:tcBorders>
-            <w:shd w:val="clear" w:color="auto" w:fill="D9E1F2"/>
           </w:tcPr>
           <w:p>
             <w:pPr>
@@ -2110,12 +2105,11 @@
           <w:tcPr>
             <w:tcW w:type="dxa" w:w="1729"/>
             <w:tcBorders>
-              <w:top w:val="single" w:sz="4" w:color="AAAAAA"/>
-              <w:left w:val="single" w:sz="4" w:color="AAAAAA"/>
-              <w:bottom w:val="single" w:sz="4" w:color="AAAAAA"/>
-              <w:right w:val="single" w:sz="4" w:color="AAAAAA"/>
+              <w:top w:val="single" w:sz="12" w:color="000000"/>
+              <w:bottom w:val="single" w:sz="6" w:color="000000"/>
+              <w:left w:val="nil"/>
+              <w:right w:val="nil"/>
             </w:tcBorders>
-            <w:shd w:val="clear" w:color="auto" w:fill="D9E1F2"/>
           </w:tcPr>
           <w:p>
             <w:pPr>
@@ -2137,12 +2131,11 @@
           <w:tcPr>
             <w:tcW w:type="dxa" w:w="1729"/>
             <w:tcBorders>
-              <w:top w:val="single" w:sz="4" w:color="AAAAAA"/>
-              <w:left w:val="single" w:sz="4" w:color="AAAAAA"/>
-              <w:bottom w:val="single" w:sz="4" w:color="AAAAAA"/>
-              <w:right w:val="single" w:sz="4" w:color="AAAAAA"/>
+              <w:top w:val="single" w:sz="12" w:color="000000"/>
+              <w:bottom w:val="single" w:sz="6" w:color="000000"/>
+              <w:left w:val="nil"/>
+              <w:right w:val="nil"/>
             </w:tcBorders>
-            <w:shd w:val="clear" w:color="auto" w:fill="D9E1F2"/>
           </w:tcPr>
           <w:p>
             <w:pPr>
@@ -2164,12 +2157,11 @@
           <w:tcPr>
             <w:tcW w:type="dxa" w:w="1729"/>
             <w:tcBorders>
-              <w:top w:val="single" w:sz="4" w:color="AAAAAA"/>
-              <w:left w:val="single" w:sz="4" w:color="AAAAAA"/>
-              <w:bottom w:val="single" w:sz="4" w:color="AAAAAA"/>
-              <w:right w:val="single" w:sz="4" w:color="AAAAAA"/>
+              <w:top w:val="single" w:sz="12" w:color="000000"/>
+              <w:bottom w:val="single" w:sz="6" w:color="000000"/>
+              <w:left w:val="nil"/>
+              <w:right w:val="nil"/>
             </w:tcBorders>
-            <w:shd w:val="clear" w:color="auto" w:fill="D9E1F2"/>
           </w:tcPr>
           <w:p>
             <w:pPr>
@@ -2193,10 +2185,10 @@
           <w:tcPr>
             <w:tcW w:type="dxa" w:w="1729"/>
             <w:tcBorders>
-              <w:top w:val="single" w:sz="4" w:color="AAAAAA"/>
-              <w:left w:val="single" w:sz="4" w:color="AAAAAA"/>
-              <w:bottom w:val="single" w:sz="4" w:color="AAAAAA"/>
-              <w:right w:val="single" w:sz="4" w:color="AAAAAA"/>
+              <w:top w:val="nil"/>
+              <w:bottom w:val="nil"/>
+              <w:left w:val="nil"/>
+              <w:right w:val="nil"/>
             </w:tcBorders>
           </w:tcPr>
           <w:p>
@@ -2219,10 +2211,10 @@
           <w:tcPr>
             <w:tcW w:type="dxa" w:w="1729"/>
             <w:tcBorders>
-              <w:top w:val="single" w:sz="4" w:color="AAAAAA"/>
-              <w:left w:val="single" w:sz="4" w:color="AAAAAA"/>
-              <w:bottom w:val="single" w:sz="4" w:color="AAAAAA"/>
-              <w:right w:val="single" w:sz="4" w:color="AAAAAA"/>
+              <w:top w:val="nil"/>
+              <w:bottom w:val="nil"/>
+              <w:left w:val="nil"/>
+              <w:right w:val="nil"/>
             </w:tcBorders>
           </w:tcPr>
           <w:p>
@@ -2245,10 +2237,10 @@
           <w:tcPr>
             <w:tcW w:type="dxa" w:w="1729"/>
             <w:tcBorders>
-              <w:top w:val="single" w:sz="4" w:color="AAAAAA"/>
-              <w:left w:val="single" w:sz="4" w:color="AAAAAA"/>
-              <w:bottom w:val="single" w:sz="4" w:color="AAAAAA"/>
-              <w:right w:val="single" w:sz="4" w:color="AAAAAA"/>
+              <w:top w:val="nil"/>
+              <w:bottom w:val="nil"/>
+              <w:left w:val="nil"/>
+              <w:right w:val="nil"/>
             </w:tcBorders>
           </w:tcPr>
           <w:p>
@@ -2271,10 +2263,10 @@
           <w:tcPr>
             <w:tcW w:type="dxa" w:w="1729"/>
             <w:tcBorders>
-              <w:top w:val="single" w:sz="4" w:color="AAAAAA"/>
-              <w:left w:val="single" w:sz="4" w:color="AAAAAA"/>
-              <w:bottom w:val="single" w:sz="4" w:color="AAAAAA"/>
-              <w:right w:val="single" w:sz="4" w:color="AAAAAA"/>
+              <w:top w:val="nil"/>
+              <w:bottom w:val="nil"/>
+              <w:left w:val="nil"/>
+              <w:right w:val="nil"/>
             </w:tcBorders>
           </w:tcPr>
           <w:p>
@@ -2297,10 +2289,10 @@
           <w:tcPr>
             <w:tcW w:type="dxa" w:w="1729"/>
             <w:tcBorders>
-              <w:top w:val="single" w:sz="4" w:color="AAAAAA"/>
-              <w:left w:val="single" w:sz="4" w:color="AAAAAA"/>
-              <w:bottom w:val="single" w:sz="4" w:color="AAAAAA"/>
-              <w:right w:val="single" w:sz="4" w:color="AAAAAA"/>
+              <w:top w:val="nil"/>
+              <w:bottom w:val="nil"/>
+              <w:left w:val="nil"/>
+              <w:right w:val="nil"/>
             </w:tcBorders>
           </w:tcPr>
           <w:p>
@@ -2325,10 +2317,10 @@
           <w:tcPr>
             <w:tcW w:type="dxa" w:w="1729"/>
             <w:tcBorders>
-              <w:top w:val="single" w:sz="4" w:color="AAAAAA"/>
-              <w:left w:val="single" w:sz="4" w:color="AAAAAA"/>
-              <w:bottom w:val="single" w:sz="4" w:color="AAAAAA"/>
-              <w:right w:val="single" w:sz="4" w:color="AAAAAA"/>
+              <w:top w:val="nil"/>
+              <w:bottom w:val="nil"/>
+              <w:left w:val="nil"/>
+              <w:right w:val="nil"/>
             </w:tcBorders>
           </w:tcPr>
           <w:p>
@@ -2351,10 +2343,10 @@
           <w:tcPr>
             <w:tcW w:type="dxa" w:w="1729"/>
             <w:tcBorders>
-              <w:top w:val="single" w:sz="4" w:color="AAAAAA"/>
-              <w:left w:val="single" w:sz="4" w:color="AAAAAA"/>
-              <w:bottom w:val="single" w:sz="4" w:color="AAAAAA"/>
-              <w:right w:val="single" w:sz="4" w:color="AAAAAA"/>
+              <w:top w:val="nil"/>
+              <w:bottom w:val="nil"/>
+              <w:left w:val="nil"/>
+              <w:right w:val="nil"/>
             </w:tcBorders>
           </w:tcPr>
           <w:p>
@@ -2377,10 +2369,10 @@
           <w:tcPr>
             <w:tcW w:type="dxa" w:w="1729"/>
             <w:tcBorders>
-              <w:top w:val="single" w:sz="4" w:color="AAAAAA"/>
-              <w:left w:val="single" w:sz="4" w:color="AAAAAA"/>
-              <w:bottom w:val="single" w:sz="4" w:color="AAAAAA"/>
-              <w:right w:val="single" w:sz="4" w:color="AAAAAA"/>
+              <w:top w:val="nil"/>
+              <w:bottom w:val="nil"/>
+              <w:left w:val="nil"/>
+              <w:right w:val="nil"/>
             </w:tcBorders>
           </w:tcPr>
           <w:p>
@@ -2403,10 +2395,10 @@
           <w:tcPr>
             <w:tcW w:type="dxa" w:w="1729"/>
             <w:tcBorders>
-              <w:top w:val="single" w:sz="4" w:color="AAAAAA"/>
-              <w:left w:val="single" w:sz="4" w:color="AAAAAA"/>
-              <w:bottom w:val="single" w:sz="4" w:color="AAAAAA"/>
-              <w:right w:val="single" w:sz="4" w:color="AAAAAA"/>
+              <w:top w:val="nil"/>
+              <w:bottom w:val="nil"/>
+              <w:left w:val="nil"/>
+              <w:right w:val="nil"/>
             </w:tcBorders>
           </w:tcPr>
           <w:p>
@@ -2429,10 +2421,10 @@
           <w:tcPr>
             <w:tcW w:type="dxa" w:w="1729"/>
             <w:tcBorders>
-              <w:top w:val="single" w:sz="4" w:color="AAAAAA"/>
-              <w:left w:val="single" w:sz="4" w:color="AAAAAA"/>
-              <w:bottom w:val="single" w:sz="4" w:color="AAAAAA"/>
-              <w:right w:val="single" w:sz="4" w:color="AAAAAA"/>
+              <w:top w:val="nil"/>
+              <w:bottom w:val="nil"/>
+              <w:left w:val="nil"/>
+              <w:right w:val="nil"/>
             </w:tcBorders>
           </w:tcPr>
           <w:p>
@@ -2457,10 +2449,10 @@
           <w:tcPr>
             <w:tcW w:type="dxa" w:w="1729"/>
             <w:tcBorders>
-              <w:top w:val="single" w:sz="4" w:color="AAAAAA"/>
-              <w:left w:val="single" w:sz="4" w:color="AAAAAA"/>
-              <w:bottom w:val="single" w:sz="4" w:color="AAAAAA"/>
-              <w:right w:val="single" w:sz="4" w:color="AAAAAA"/>
+              <w:top w:val="nil"/>
+              <w:bottom w:val="nil"/>
+              <w:left w:val="nil"/>
+              <w:right w:val="nil"/>
             </w:tcBorders>
           </w:tcPr>
           <w:p>
@@ -2483,10 +2475,10 @@
           <w:tcPr>
             <w:tcW w:type="dxa" w:w="1729"/>
             <w:tcBorders>
-              <w:top w:val="single" w:sz="4" w:color="AAAAAA"/>
-              <w:left w:val="single" w:sz="4" w:color="AAAAAA"/>
-              <w:bottom w:val="single" w:sz="4" w:color="AAAAAA"/>
-              <w:right w:val="single" w:sz="4" w:color="AAAAAA"/>
+              <w:top w:val="nil"/>
+              <w:bottom w:val="nil"/>
+              <w:left w:val="nil"/>
+              <w:right w:val="nil"/>
             </w:tcBorders>
           </w:tcPr>
           <w:p>
@@ -2509,10 +2501,10 @@
           <w:tcPr>
             <w:tcW w:type="dxa" w:w="1729"/>
             <w:tcBorders>
-              <w:top w:val="single" w:sz="4" w:color="AAAAAA"/>
-              <w:left w:val="single" w:sz="4" w:color="AAAAAA"/>
-              <w:bottom w:val="single" w:sz="4" w:color="AAAAAA"/>
-              <w:right w:val="single" w:sz="4" w:color="AAAAAA"/>
+              <w:top w:val="nil"/>
+              <w:bottom w:val="nil"/>
+              <w:left w:val="nil"/>
+              <w:right w:val="nil"/>
             </w:tcBorders>
           </w:tcPr>
           <w:p>
@@ -2535,10 +2527,10 @@
           <w:tcPr>
             <w:tcW w:type="dxa" w:w="1729"/>
             <w:tcBorders>
-              <w:top w:val="single" w:sz="4" w:color="AAAAAA"/>
-              <w:left w:val="single" w:sz="4" w:color="AAAAAA"/>
-              <w:bottom w:val="single" w:sz="4" w:color="AAAAAA"/>
-              <w:right w:val="single" w:sz="4" w:color="AAAAAA"/>
+              <w:top w:val="nil"/>
+              <w:bottom w:val="nil"/>
+              <w:left w:val="nil"/>
+              <w:right w:val="nil"/>
             </w:tcBorders>
           </w:tcPr>
           <w:p>
@@ -2561,10 +2553,10 @@
           <w:tcPr>
             <w:tcW w:type="dxa" w:w="1729"/>
             <w:tcBorders>
-              <w:top w:val="single" w:sz="4" w:color="AAAAAA"/>
-              <w:left w:val="single" w:sz="4" w:color="AAAAAA"/>
-              <w:bottom w:val="single" w:sz="4" w:color="AAAAAA"/>
-              <w:right w:val="single" w:sz="4" w:color="AAAAAA"/>
+              <w:top w:val="nil"/>
+              <w:bottom w:val="nil"/>
+              <w:left w:val="nil"/>
+              <w:right w:val="nil"/>
             </w:tcBorders>
           </w:tcPr>
           <w:p>
@@ -2589,10 +2581,10 @@
           <w:tcPr>
             <w:tcW w:type="dxa" w:w="1729"/>
             <w:tcBorders>
-              <w:top w:val="single" w:sz="4" w:color="AAAAAA"/>
-              <w:left w:val="single" w:sz="4" w:color="AAAAAA"/>
-              <w:bottom w:val="single" w:sz="4" w:color="AAAAAA"/>
-              <w:right w:val="single" w:sz="4" w:color="AAAAAA"/>
+              <w:top w:val="nil"/>
+              <w:bottom w:val="nil"/>
+              <w:left w:val="nil"/>
+              <w:right w:val="nil"/>
             </w:tcBorders>
           </w:tcPr>
           <w:p>
@@ -2615,10 +2607,10 @@
           <w:tcPr>
             <w:tcW w:type="dxa" w:w="1729"/>
             <w:tcBorders>
-              <w:top w:val="single" w:sz="4" w:color="AAAAAA"/>
-              <w:left w:val="single" w:sz="4" w:color="AAAAAA"/>
-              <w:bottom w:val="single" w:sz="4" w:color="AAAAAA"/>
-              <w:right w:val="single" w:sz="4" w:color="AAAAAA"/>
+              <w:top w:val="nil"/>
+              <w:bottom w:val="nil"/>
+              <w:left w:val="nil"/>
+              <w:right w:val="nil"/>
             </w:tcBorders>
           </w:tcPr>
           <w:p>
@@ -2641,10 +2633,10 @@
           <w:tcPr>
             <w:tcW w:type="dxa" w:w="1729"/>
             <w:tcBorders>
-              <w:top w:val="single" w:sz="4" w:color="AAAAAA"/>
-              <w:left w:val="single" w:sz="4" w:color="AAAAAA"/>
-              <w:bottom w:val="single" w:sz="4" w:color="AAAAAA"/>
-              <w:right w:val="single" w:sz="4" w:color="AAAAAA"/>
+              <w:top w:val="nil"/>
+              <w:bottom w:val="nil"/>
+              <w:left w:val="nil"/>
+              <w:right w:val="nil"/>
             </w:tcBorders>
           </w:tcPr>
           <w:p>
@@ -2667,10 +2659,10 @@
           <w:tcPr>
             <w:tcW w:type="dxa" w:w="1729"/>
             <w:tcBorders>
-              <w:top w:val="single" w:sz="4" w:color="AAAAAA"/>
-              <w:left w:val="single" w:sz="4" w:color="AAAAAA"/>
-              <w:bottom w:val="single" w:sz="4" w:color="AAAAAA"/>
-              <w:right w:val="single" w:sz="4" w:color="AAAAAA"/>
+              <w:top w:val="nil"/>
+              <w:bottom w:val="nil"/>
+              <w:left w:val="nil"/>
+              <w:right w:val="nil"/>
             </w:tcBorders>
           </w:tcPr>
           <w:p>
@@ -2693,10 +2685,10 @@
           <w:tcPr>
             <w:tcW w:type="dxa" w:w="1729"/>
             <w:tcBorders>
-              <w:top w:val="single" w:sz="4" w:color="AAAAAA"/>
-              <w:left w:val="single" w:sz="4" w:color="AAAAAA"/>
-              <w:bottom w:val="single" w:sz="4" w:color="AAAAAA"/>
-              <w:right w:val="single" w:sz="4" w:color="AAAAAA"/>
+              <w:top w:val="nil"/>
+              <w:bottom w:val="nil"/>
+              <w:left w:val="nil"/>
+              <w:right w:val="nil"/>
             </w:tcBorders>
           </w:tcPr>
           <w:p>
@@ -2721,10 +2713,10 @@
           <w:tcPr>
             <w:tcW w:type="dxa" w:w="1729"/>
             <w:tcBorders>
-              <w:top w:val="single" w:sz="4" w:color="AAAAAA"/>
-              <w:left w:val="single" w:sz="4" w:color="AAAAAA"/>
-              <w:bottom w:val="single" w:sz="4" w:color="AAAAAA"/>
-              <w:right w:val="single" w:sz="4" w:color="AAAAAA"/>
+              <w:top w:val="nil"/>
+              <w:bottom w:val="single" w:sz="6" w:color="000000"/>
+              <w:left w:val="nil"/>
+              <w:right w:val="nil"/>
             </w:tcBorders>
           </w:tcPr>
           <w:p>
@@ -2747,10 +2739,10 @@
           <w:tcPr>
             <w:tcW w:type="dxa" w:w="1729"/>
             <w:tcBorders>
-              <w:top w:val="single" w:sz="4" w:color="AAAAAA"/>
-              <w:left w:val="single" w:sz="4" w:color="AAAAAA"/>
-              <w:bottom w:val="single" w:sz="4" w:color="AAAAAA"/>
-              <w:right w:val="single" w:sz="4" w:color="AAAAAA"/>
+              <w:top w:val="nil"/>
+              <w:bottom w:val="single" w:sz="6" w:color="000000"/>
+              <w:left w:val="nil"/>
+              <w:right w:val="nil"/>
             </w:tcBorders>
           </w:tcPr>
           <w:p>
@@ -2773,10 +2765,10 @@
           <w:tcPr>
             <w:tcW w:type="dxa" w:w="1729"/>
             <w:tcBorders>
-              <w:top w:val="single" w:sz="4" w:color="AAAAAA"/>
-              <w:left w:val="single" w:sz="4" w:color="AAAAAA"/>
-              <w:bottom w:val="single" w:sz="4" w:color="AAAAAA"/>
-              <w:right w:val="single" w:sz="4" w:color="AAAAAA"/>
+              <w:top w:val="nil"/>
+              <w:bottom w:val="single" w:sz="6" w:color="000000"/>
+              <w:left w:val="nil"/>
+              <w:right w:val="nil"/>
             </w:tcBorders>
           </w:tcPr>
           <w:p>
@@ -2799,10 +2791,10 @@
           <w:tcPr>
             <w:tcW w:type="dxa" w:w="1729"/>
             <w:tcBorders>
-              <w:top w:val="single" w:sz="4" w:color="AAAAAA"/>
-              <w:left w:val="single" w:sz="4" w:color="AAAAAA"/>
-              <w:bottom w:val="single" w:sz="4" w:color="AAAAAA"/>
-              <w:right w:val="single" w:sz="4" w:color="AAAAAA"/>
+              <w:top w:val="nil"/>
+              <w:bottom w:val="single" w:sz="6" w:color="000000"/>
+              <w:left w:val="nil"/>
+              <w:right w:val="nil"/>
             </w:tcBorders>
           </w:tcPr>
           <w:p>
@@ -2825,10 +2817,10 @@
           <w:tcPr>
             <w:tcW w:type="dxa" w:w="1729"/>
             <w:tcBorders>
-              <w:top w:val="single" w:sz="4" w:color="AAAAAA"/>
-              <w:left w:val="single" w:sz="4" w:color="AAAAAA"/>
-              <w:bottom w:val="single" w:sz="4" w:color="AAAAAA"/>
-              <w:right w:val="single" w:sz="4" w:color="AAAAAA"/>
+              <w:top w:val="nil"/>
+              <w:bottom w:val="single" w:sz="6" w:color="000000"/>
+              <w:left w:val="nil"/>
+              <w:right w:val="nil"/>
             </w:tcBorders>
           </w:tcPr>
           <w:p>
@@ -3271,7 +3263,7 @@
           <w:color w:val="000000"/>
           <w:sz w:val="32"/>
         </w:rPr>
-        <w:t>二级标题：嵌入图片（仅 PDF）</w:t>
+        <w:t>二级标题：嵌入图片</w:t>
       </w:r>
     </w:p>
     <w:p>
@@ -4250,7 +4242,7 @@
           <w:i w:val="0"/>
           <w:sz w:val="24"/>
         </w:rPr>
-        <w:t>，仅 PDF）</w:t>
+        <w:t>，DOCX 和 PDF 均支持）</w:t>
       </w:r>
     </w:p>
     <w:p>

</xml_diff>

<commit_message>
style(doc-forge): switch DOCX body font to PingFang SC
Replace 宋体/黑体/仿宋 with PingFang SC across all DOCX text zones
(body, headings, blockquote, table); English companion font updated
from Times New Roman to Arial for consistent sans-serif pairing.
PDF already uses PingFang SC as first priority — no CSS change needed.

Co-Authored-By: Claude Sonnet 4.6 <noreply@anthropic.com>
</commit_message>
<xml_diff>
--- a/skills/writing/doc-forge/tests/fixtures/full-test.docx
+++ b/skills/writing/doc-forge/tests/fixtures/full-test.docx
@@ -9,7 +9,7 @@
       </w:pPr>
       <w:r>
         <w:rPr>
-          <w:rFonts w:ascii="Arial" w:hAnsi="Arial" w:eastAsia="黑体"/>
+          <w:rFonts w:ascii="Arial" w:hAnsi="Arial" w:eastAsia="PingFang SC"/>
           <w:b/>
           <w:i w:val="0"/>
           <w:color w:val="000000"/>
@@ -26,7 +26,7 @@
       </w:pPr>
       <w:r>
         <w:rPr>
-          <w:rFonts w:ascii="Times New Roman" w:hAnsi="Times New Roman" w:eastAsia="宋体"/>
+          <w:rFonts w:ascii="Arial" w:hAnsi="Arial" w:eastAsia="PingFang SC"/>
           <w:b w:val="0"/>
           <w:i w:val="0"/>
           <w:sz w:val="24"/>
@@ -53,7 +53,7 @@
       </w:pPr>
       <w:r>
         <w:rPr>
-          <w:rFonts w:ascii="Arial" w:hAnsi="Arial" w:eastAsia="黑体"/>
+          <w:rFonts w:ascii="Arial" w:hAnsi="Arial" w:eastAsia="PingFang SC"/>
           <w:b/>
           <w:i w:val="0"/>
           <w:color w:val="000000"/>
@@ -70,7 +70,7 @@
       </w:pPr>
       <w:r>
         <w:rPr>
-          <w:rFonts w:ascii="Times New Roman" w:hAnsi="Times New Roman" w:eastAsia="宋体"/>
+          <w:rFonts w:ascii="Arial" w:hAnsi="Arial" w:eastAsia="PingFang SC"/>
           <w:b w:val="0"/>
           <w:i w:val="0"/>
           <w:sz w:val="24"/>
@@ -86,7 +86,7 @@
       </w:pPr>
       <w:r>
         <w:rPr>
-          <w:rFonts w:ascii="Times New Roman" w:hAnsi="Times New Roman" w:eastAsia="宋体"/>
+          <w:rFonts w:ascii="Arial" w:hAnsi="Arial" w:eastAsia="PingFang SC"/>
           <w:b w:val="0"/>
           <w:i w:val="0"/>
           <w:sz w:val="24"/>
@@ -95,7 +95,7 @@
       </w:r>
       <w:r>
         <w:rPr>
-          <w:rFonts w:ascii="Times New Roman" w:hAnsi="Times New Roman" w:eastAsia="宋体"/>
+          <w:rFonts w:ascii="Arial" w:hAnsi="Arial" w:eastAsia="PingFang SC"/>
           <w:b/>
           <w:i w:val="0"/>
           <w:sz w:val="24"/>
@@ -104,7 +104,7 @@
       </w:r>
       <w:r>
         <w:rPr>
-          <w:rFonts w:ascii="Times New Roman" w:hAnsi="Times New Roman" w:eastAsia="宋体"/>
+          <w:rFonts w:ascii="Arial" w:hAnsi="Arial" w:eastAsia="PingFang SC"/>
           <w:b w:val="0"/>
           <w:i w:val="0"/>
           <w:sz w:val="24"/>
@@ -113,7 +113,7 @@
       </w:r>
       <w:r>
         <w:rPr>
-          <w:rFonts w:ascii="Times New Roman" w:hAnsi="Times New Roman" w:eastAsia="宋体"/>
+          <w:rFonts w:ascii="Arial" w:hAnsi="Arial" w:eastAsia="PingFang SC"/>
           <w:b w:val="0"/>
           <w:i/>
           <w:sz w:val="24"/>
@@ -122,7 +122,7 @@
       </w:r>
       <w:r>
         <w:rPr>
-          <w:rFonts w:ascii="Times New Roman" w:hAnsi="Times New Roman" w:eastAsia="宋体"/>
+          <w:rFonts w:ascii="Arial" w:hAnsi="Arial" w:eastAsia="PingFang SC"/>
           <w:b w:val="0"/>
           <w:i w:val="0"/>
           <w:sz w:val="24"/>
@@ -131,7 +131,7 @@
       </w:r>
       <w:r>
         <w:rPr>
-          <w:rFonts w:ascii="Times New Roman" w:hAnsi="Times New Roman" w:eastAsia="宋体"/>
+          <w:rFonts w:ascii="Arial" w:hAnsi="Arial" w:eastAsia="PingFang SC"/>
           <w:b w:val="0"/>
           <w:i w:val="0"/>
           <w:strike/>
@@ -141,7 +141,7 @@
       </w:r>
       <w:r>
         <w:rPr>
-          <w:rFonts w:ascii="Times New Roman" w:hAnsi="Times New Roman" w:eastAsia="宋体"/>
+          <w:rFonts w:ascii="Arial" w:hAnsi="Arial" w:eastAsia="PingFang SC"/>
           <w:b w:val="0"/>
           <w:i w:val="0"/>
           <w:sz w:val="24"/>
@@ -157,7 +157,7 @@
       </w:r>
       <w:r>
         <w:rPr>
-          <w:rFonts w:ascii="Times New Roman" w:hAnsi="Times New Roman" w:eastAsia="宋体"/>
+          <w:rFonts w:ascii="Arial" w:hAnsi="Arial" w:eastAsia="PingFang SC"/>
           <w:b w:val="0"/>
           <w:i w:val="0"/>
           <w:sz w:val="24"/>
@@ -166,7 +166,7 @@
       </w:r>
       <w:r>
         <w:rPr>
-          <w:rFonts w:ascii="Times New Roman" w:hAnsi="Times New Roman" w:eastAsia="宋体"/>
+          <w:rFonts w:ascii="Arial" w:hAnsi="Arial" w:eastAsia="PingFang SC"/>
           <w:b/>
           <w:i w:val="0"/>
           <w:sz w:val="24"/>
@@ -175,7 +175,7 @@
       </w:r>
       <w:r>
         <w:rPr>
-          <w:rFonts w:ascii="Times New Roman" w:hAnsi="Times New Roman" w:eastAsia="宋体"/>
+          <w:rFonts w:ascii="Arial" w:hAnsi="Arial" w:eastAsia="PingFang SC"/>
           <w:b w:val="0"/>
           <w:i w:val="0"/>
           <w:sz w:val="24"/>
@@ -191,7 +191,7 @@
       </w:pPr>
       <w:r>
         <w:rPr>
-          <w:rFonts w:ascii="Times New Roman" w:hAnsi="Times New Roman" w:eastAsia="宋体"/>
+          <w:rFonts w:ascii="Arial" w:hAnsi="Arial" w:eastAsia="PingFang SC"/>
           <w:b w:val="0"/>
           <w:i w:val="0"/>
           <w:sz w:val="24"/>
@@ -200,7 +200,7 @@
       </w:r>
       <w:r>
         <w:rPr>
-          <w:rFonts w:ascii="Times New Roman" w:hAnsi="Times New Roman" w:eastAsia="宋体"/>
+          <w:rFonts w:ascii="Arial" w:hAnsi="Arial" w:eastAsia="PingFang SC"/>
           <w:b w:val="0"/>
           <w:i w:val="0"/>
           <w:color w:val="1155CC"/>
@@ -211,7 +211,7 @@
       </w:r>
       <w:r>
         <w:rPr>
-          <w:rFonts w:ascii="Times New Roman" w:hAnsi="Times New Roman" w:eastAsia="宋体"/>
+          <w:rFonts w:ascii="Arial" w:hAnsi="Arial" w:eastAsia="PingFang SC"/>
           <w:b w:val="0"/>
           <w:i w:val="0"/>
           <w:sz w:val="24"/>
@@ -220,7 +220,7 @@
       </w:r>
       <w:r>
         <w:rPr>
-          <w:rFonts w:ascii="Times New Roman" w:hAnsi="Times New Roman" w:eastAsia="宋体"/>
+          <w:rFonts w:ascii="Arial" w:hAnsi="Arial" w:eastAsia="PingFang SC"/>
           <w:b w:val="0"/>
           <w:i w:val="0"/>
           <w:color w:val="1155CC"/>
@@ -231,7 +231,7 @@
       </w:r>
       <w:r>
         <w:rPr>
-          <w:rFonts w:ascii="Times New Roman" w:hAnsi="Times New Roman" w:eastAsia="宋体"/>
+          <w:rFonts w:ascii="Arial" w:hAnsi="Arial" w:eastAsia="PingFang SC"/>
           <w:b w:val="0"/>
           <w:i w:val="0"/>
           <w:sz w:val="24"/>
@@ -247,7 +247,7 @@
       </w:pPr>
       <w:r>
         <w:rPr>
-          <w:rFonts w:ascii="Times New Roman" w:hAnsi="Times New Roman" w:eastAsia="宋体"/>
+          <w:rFonts w:ascii="Arial" w:hAnsi="Arial" w:eastAsia="PingFang SC"/>
           <w:b w:val="0"/>
           <w:i w:val="0"/>
           <w:sz w:val="24"/>
@@ -256,7 +256,7 @@
       </w:r>
       <w:r>
         <w:rPr>
-          <w:rFonts w:ascii="Times New Roman" w:hAnsi="Times New Roman" w:eastAsia="宋体"/>
+          <w:rFonts w:ascii="Arial" w:hAnsi="Arial" w:eastAsia="PingFang SC"/>
           <w:b/>
           <w:i w:val="0"/>
           <w:sz w:val="24"/>
@@ -265,7 +265,7 @@
       </w:r>
       <w:r>
         <w:rPr>
-          <w:rFonts w:ascii="Times New Roman" w:hAnsi="Times New Roman" w:eastAsia="宋体"/>
+          <w:rFonts w:ascii="Arial" w:hAnsi="Arial" w:eastAsia="PingFang SC"/>
           <w:b w:val="0"/>
           <w:i w:val="0"/>
           <w:sz w:val="24"/>
@@ -274,7 +274,7 @@
       </w:r>
       <w:r>
         <w:rPr>
-          <w:rFonts w:ascii="Times New Roman" w:hAnsi="Times New Roman" w:eastAsia="宋体"/>
+          <w:rFonts w:ascii="Arial" w:hAnsi="Arial" w:eastAsia="PingFang SC"/>
           <w:b w:val="0"/>
           <w:i/>
           <w:sz w:val="24"/>
@@ -283,7 +283,7 @@
       </w:r>
       <w:r>
         <w:rPr>
-          <w:rFonts w:ascii="Times New Roman" w:hAnsi="Times New Roman" w:eastAsia="宋体"/>
+          <w:rFonts w:ascii="Arial" w:hAnsi="Arial" w:eastAsia="PingFang SC"/>
           <w:b w:val="0"/>
           <w:i w:val="0"/>
           <w:sz w:val="24"/>
@@ -299,7 +299,7 @@
       </w:r>
       <w:r>
         <w:rPr>
-          <w:rFonts w:ascii="Times New Roman" w:hAnsi="Times New Roman" w:eastAsia="宋体"/>
+          <w:rFonts w:ascii="Arial" w:hAnsi="Arial" w:eastAsia="PingFang SC"/>
           <w:b w:val="0"/>
           <w:i w:val="0"/>
           <w:sz w:val="24"/>
@@ -308,7 +308,7 @@
       </w:r>
       <w:r>
         <w:rPr>
-          <w:rFonts w:ascii="Times New Roman" w:hAnsi="Times New Roman" w:eastAsia="宋体"/>
+          <w:rFonts w:ascii="Arial" w:hAnsi="Arial" w:eastAsia="PingFang SC"/>
           <w:b w:val="0"/>
           <w:i w:val="0"/>
           <w:strike/>
@@ -318,7 +318,7 @@
       </w:r>
       <w:r>
         <w:rPr>
-          <w:rFonts w:ascii="Times New Roman" w:hAnsi="Times New Roman" w:eastAsia="宋体"/>
+          <w:rFonts w:ascii="Arial" w:hAnsi="Arial" w:eastAsia="PingFang SC"/>
           <w:b w:val="0"/>
           <w:i w:val="0"/>
           <w:sz w:val="24"/>
@@ -327,7 +327,7 @@
       </w:r>
       <w:r>
         <w:rPr>
-          <w:rFonts w:ascii="Times New Roman" w:hAnsi="Times New Roman" w:eastAsia="宋体"/>
+          <w:rFonts w:ascii="Arial" w:hAnsi="Arial" w:eastAsia="PingFang SC"/>
           <w:b/>
           <w:i w:val="0"/>
           <w:sz w:val="24"/>
@@ -336,7 +336,7 @@
       </w:r>
       <w:r>
         <w:rPr>
-          <w:rFonts w:ascii="Times New Roman" w:hAnsi="Times New Roman" w:eastAsia="宋体"/>
+          <w:rFonts w:ascii="Arial" w:hAnsi="Arial" w:eastAsia="PingFang SC"/>
           <w:b w:val="0"/>
           <w:i w:val="0"/>
           <w:sz w:val="24"/>
@@ -351,7 +351,7 @@
       </w:pPr>
       <w:r>
         <w:rPr>
-          <w:rFonts w:ascii="Arial" w:hAnsi="Arial" w:eastAsia="黑体"/>
+          <w:rFonts w:ascii="Arial" w:hAnsi="Arial" w:eastAsia="PingFang SC"/>
           <w:b/>
           <w:i w:val="0"/>
           <w:color w:val="333333"/>
@@ -367,7 +367,7 @@
       </w:pPr>
       <w:r>
         <w:rPr>
-          <w:rFonts w:ascii="Arial" w:hAnsi="Arial" w:eastAsia="仿宋"/>
+          <w:rFonts w:ascii="Arial" w:hAnsi="Arial" w:eastAsia="PingFang SC"/>
           <w:b/>
           <w:i w:val="0"/>
           <w:color w:val="333333"/>
@@ -384,7 +384,7 @@
       </w:pPr>
       <w:r>
         <w:rPr>
-          <w:rFonts w:ascii="Times New Roman" w:hAnsi="Times New Roman" w:eastAsia="宋体"/>
+          <w:rFonts w:ascii="Arial" w:hAnsi="Arial" w:eastAsia="PingFang SC"/>
           <w:b w:val="0"/>
           <w:i w:val="0"/>
           <w:sz w:val="24"/>
@@ -393,7 +393,7 @@
       </w:r>
       <w:r>
         <w:rPr>
-          <w:rFonts w:ascii="Times New Roman" w:hAnsi="Times New Roman" w:eastAsia="宋体"/>
+          <w:rFonts w:ascii="Arial" w:hAnsi="Arial" w:eastAsia="PingFang SC"/>
           <w:b w:val="0"/>
           <w:i w:val="0"/>
           <w:sz w:val="24"/>
@@ -409,7 +409,7 @@
       </w:pPr>
       <w:r>
         <w:rPr>
-          <w:rFonts w:ascii="Times New Roman" w:hAnsi="Times New Roman" w:eastAsia="宋体"/>
+          <w:rFonts w:ascii="Arial" w:hAnsi="Arial" w:eastAsia="PingFang SC"/>
           <w:b w:val="0"/>
           <w:i w:val="0"/>
           <w:sz w:val="24"/>
@@ -418,7 +418,7 @@
       </w:r>
       <w:r>
         <w:rPr>
-          <w:rFonts w:ascii="Times New Roman" w:hAnsi="Times New Roman" w:eastAsia="宋体"/>
+          <w:rFonts w:ascii="Arial" w:hAnsi="Arial" w:eastAsia="PingFang SC"/>
           <w:b w:val="0"/>
           <w:i w:val="0"/>
           <w:sz w:val="24"/>
@@ -427,7 +427,7 @@
       </w:r>
       <w:r>
         <w:rPr>
-          <w:rFonts w:ascii="Times New Roman" w:hAnsi="Times New Roman" w:eastAsia="宋体"/>
+          <w:rFonts w:ascii="Arial" w:hAnsi="Arial" w:eastAsia="PingFang SC"/>
           <w:b/>
           <w:i w:val="0"/>
           <w:sz w:val="24"/>
@@ -436,7 +436,7 @@
       </w:r>
       <w:r>
         <w:rPr>
-          <w:rFonts w:ascii="Times New Roman" w:hAnsi="Times New Roman" w:eastAsia="宋体"/>
+          <w:rFonts w:ascii="Arial" w:hAnsi="Arial" w:eastAsia="PingFang SC"/>
           <w:b w:val="0"/>
           <w:i w:val="0"/>
           <w:sz w:val="24"/>
@@ -459,7 +459,7 @@
       </w:pPr>
       <w:r>
         <w:rPr>
-          <w:rFonts w:ascii="Times New Roman" w:hAnsi="Times New Roman" w:eastAsia="宋体"/>
+          <w:rFonts w:ascii="Arial" w:hAnsi="Arial" w:eastAsia="PingFang SC"/>
           <w:b w:val="0"/>
           <w:i w:val="0"/>
           <w:sz w:val="24"/>
@@ -468,7 +468,7 @@
       </w:r>
       <w:r>
         <w:rPr>
-          <w:rFonts w:ascii="Times New Roman" w:hAnsi="Times New Roman" w:eastAsia="宋体"/>
+          <w:rFonts w:ascii="Arial" w:hAnsi="Arial" w:eastAsia="PingFang SC"/>
           <w:b w:val="0"/>
           <w:i w:val="0"/>
           <w:sz w:val="24"/>
@@ -484,7 +484,7 @@
       </w:pPr>
       <w:r>
         <w:rPr>
-          <w:rFonts w:ascii="Times New Roman" w:hAnsi="Times New Roman" w:eastAsia="宋体"/>
+          <w:rFonts w:ascii="Arial" w:hAnsi="Arial" w:eastAsia="PingFang SC"/>
           <w:b w:val="0"/>
           <w:i w:val="0"/>
           <w:sz w:val="24"/>
@@ -493,7 +493,7 @@
       </w:r>
       <w:r>
         <w:rPr>
-          <w:rFonts w:ascii="Times New Roman" w:hAnsi="Times New Roman" w:eastAsia="宋体"/>
+          <w:rFonts w:ascii="Arial" w:hAnsi="Arial" w:eastAsia="PingFang SC"/>
           <w:b w:val="0"/>
           <w:i w:val="0"/>
           <w:sz w:val="24"/>
@@ -509,7 +509,7 @@
       </w:pPr>
       <w:r>
         <w:rPr>
-          <w:rFonts w:ascii="Times New Roman" w:hAnsi="Times New Roman" w:eastAsia="宋体"/>
+          <w:rFonts w:ascii="Arial" w:hAnsi="Arial" w:eastAsia="PingFang SC"/>
           <w:b w:val="0"/>
           <w:i w:val="0"/>
           <w:sz w:val="24"/>
@@ -518,7 +518,7 @@
       </w:r>
       <w:r>
         <w:rPr>
-          <w:rFonts w:ascii="Times New Roman" w:hAnsi="Times New Roman" w:eastAsia="宋体"/>
+          <w:rFonts w:ascii="Arial" w:hAnsi="Arial" w:eastAsia="PingFang SC"/>
           <w:b w:val="0"/>
           <w:i w:val="0"/>
           <w:sz w:val="24"/>
@@ -534,7 +534,7 @@
       </w:pPr>
       <w:r>
         <w:rPr>
-          <w:rFonts w:ascii="Times New Roman" w:hAnsi="Times New Roman" w:eastAsia="宋体"/>
+          <w:rFonts w:ascii="Arial" w:hAnsi="Arial" w:eastAsia="PingFang SC"/>
           <w:b w:val="0"/>
           <w:i w:val="0"/>
           <w:sz w:val="24"/>
@@ -543,7 +543,7 @@
       </w:r>
       <w:r>
         <w:rPr>
-          <w:rFonts w:ascii="Times New Roman" w:hAnsi="Times New Roman" w:eastAsia="宋体"/>
+          <w:rFonts w:ascii="Arial" w:hAnsi="Arial" w:eastAsia="PingFang SC"/>
           <w:b w:val="0"/>
           <w:i w:val="0"/>
           <w:sz w:val="24"/>
@@ -559,7 +559,7 @@
       </w:pPr>
       <w:r>
         <w:rPr>
-          <w:rFonts w:ascii="Times New Roman" w:hAnsi="Times New Roman" w:eastAsia="宋体"/>
+          <w:rFonts w:ascii="Arial" w:hAnsi="Arial" w:eastAsia="PingFang SC"/>
           <w:b w:val="0"/>
           <w:i w:val="0"/>
           <w:sz w:val="24"/>
@@ -568,7 +568,7 @@
       </w:r>
       <w:r>
         <w:rPr>
-          <w:rFonts w:ascii="Times New Roman" w:hAnsi="Times New Roman" w:eastAsia="宋体"/>
+          <w:rFonts w:ascii="Arial" w:hAnsi="Arial" w:eastAsia="PingFang SC"/>
           <w:b w:val="0"/>
           <w:i w:val="0"/>
           <w:sz w:val="24"/>
@@ -584,7 +584,7 @@
       </w:pPr>
       <w:r>
         <w:rPr>
-          <w:rFonts w:ascii="Times New Roman" w:hAnsi="Times New Roman" w:eastAsia="宋体"/>
+          <w:rFonts w:ascii="Arial" w:hAnsi="Arial" w:eastAsia="PingFang SC"/>
           <w:b w:val="0"/>
           <w:i w:val="0"/>
           <w:sz w:val="24"/>
@@ -593,7 +593,7 @@
       </w:r>
       <w:r>
         <w:rPr>
-          <w:rFonts w:ascii="Times New Roman" w:hAnsi="Times New Roman" w:eastAsia="宋体"/>
+          <w:rFonts w:ascii="Arial" w:hAnsi="Arial" w:eastAsia="PingFang SC"/>
           <w:b w:val="0"/>
           <w:i w:val="0"/>
           <w:sz w:val="24"/>
@@ -609,7 +609,7 @@
       </w:pPr>
       <w:r>
         <w:rPr>
-          <w:rFonts w:ascii="Times New Roman" w:hAnsi="Times New Roman" w:eastAsia="宋体"/>
+          <w:rFonts w:ascii="Arial" w:hAnsi="Arial" w:eastAsia="PingFang SC"/>
           <w:b w:val="0"/>
           <w:i w:val="0"/>
           <w:sz w:val="24"/>
@@ -618,7 +618,7 @@
       </w:r>
       <w:r>
         <w:rPr>
-          <w:rFonts w:ascii="Times New Roman" w:hAnsi="Times New Roman" w:eastAsia="宋体"/>
+          <w:rFonts w:ascii="Arial" w:hAnsi="Arial" w:eastAsia="PingFang SC"/>
           <w:b w:val="0"/>
           <w:i w:val="0"/>
           <w:sz w:val="24"/>
@@ -633,7 +633,7 @@
       </w:pPr>
       <w:r>
         <w:rPr>
-          <w:rFonts w:ascii="Arial" w:hAnsi="Arial" w:eastAsia="仿宋"/>
+          <w:rFonts w:ascii="Arial" w:hAnsi="Arial" w:eastAsia="PingFang SC"/>
           <w:b/>
           <w:i w:val="0"/>
           <w:color w:val="333333"/>
@@ -650,7 +650,7 @@
       </w:pPr>
       <w:r>
         <w:rPr>
-          <w:rFonts w:ascii="Times New Roman" w:hAnsi="Times New Roman" w:eastAsia="宋体"/>
+          <w:rFonts w:ascii="Arial" w:hAnsi="Arial" w:eastAsia="PingFang SC"/>
           <w:b/>
           <w:i w:val="0"/>
           <w:sz w:val="24"/>
@@ -659,7 +659,7 @@
       </w:r>
       <w:r>
         <w:rPr>
-          <w:rFonts w:ascii="Times New Roman" w:hAnsi="Times New Roman" w:eastAsia="宋体"/>
+          <w:rFonts w:ascii="Arial" w:hAnsi="Arial" w:eastAsia="PingFang SC"/>
           <w:b w:val="0"/>
           <w:i w:val="0"/>
           <w:sz w:val="24"/>
@@ -675,7 +675,7 @@
       </w:pPr>
       <w:r>
         <w:rPr>
-          <w:rFonts w:ascii="Times New Roman" w:hAnsi="Times New Roman" w:eastAsia="宋体"/>
+          <w:rFonts w:ascii="Arial" w:hAnsi="Arial" w:eastAsia="PingFang SC"/>
           <w:b/>
           <w:i w:val="0"/>
           <w:sz w:val="24"/>
@@ -684,7 +684,7 @@
       </w:r>
       <w:r>
         <w:rPr>
-          <w:rFonts w:ascii="Times New Roman" w:hAnsi="Times New Roman" w:eastAsia="宋体"/>
+          <w:rFonts w:ascii="Arial" w:hAnsi="Arial" w:eastAsia="PingFang SC"/>
           <w:b w:val="0"/>
           <w:i w:val="0"/>
           <w:sz w:val="24"/>
@@ -700,7 +700,7 @@
       </w:pPr>
       <w:r>
         <w:rPr>
-          <w:rFonts w:ascii="Times New Roman" w:hAnsi="Times New Roman" w:eastAsia="宋体"/>
+          <w:rFonts w:ascii="Arial" w:hAnsi="Arial" w:eastAsia="PingFang SC"/>
           <w:b/>
           <w:i w:val="0"/>
           <w:sz w:val="24"/>
@@ -709,7 +709,7 @@
       </w:r>
       <w:r>
         <w:rPr>
-          <w:rFonts w:ascii="Times New Roman" w:hAnsi="Times New Roman" w:eastAsia="宋体"/>
+          <w:rFonts w:ascii="Arial" w:hAnsi="Arial" w:eastAsia="PingFang SC"/>
           <w:b w:val="0"/>
           <w:i w:val="0"/>
           <w:sz w:val="24"/>
@@ -725,7 +725,7 @@
       </w:pPr>
       <w:r>
         <w:rPr>
-          <w:rFonts w:ascii="Times New Roman" w:hAnsi="Times New Roman" w:eastAsia="宋体"/>
+          <w:rFonts w:ascii="Arial" w:hAnsi="Arial" w:eastAsia="PingFang SC"/>
           <w:b/>
           <w:i w:val="0"/>
           <w:sz w:val="24"/>
@@ -734,7 +734,7 @@
       </w:r>
       <w:r>
         <w:rPr>
-          <w:rFonts w:ascii="Times New Roman" w:hAnsi="Times New Roman" w:eastAsia="宋体"/>
+          <w:rFonts w:ascii="Arial" w:hAnsi="Arial" w:eastAsia="PingFang SC"/>
           <w:b w:val="0"/>
           <w:i w:val="0"/>
           <w:sz w:val="24"/>
@@ -750,7 +750,7 @@
       </w:pPr>
       <w:r>
         <w:rPr>
-          <w:rFonts w:ascii="Times New Roman" w:hAnsi="Times New Roman" w:eastAsia="宋体"/>
+          <w:rFonts w:ascii="Arial" w:hAnsi="Arial" w:eastAsia="PingFang SC"/>
           <w:b/>
           <w:i w:val="0"/>
           <w:sz w:val="24"/>
@@ -759,7 +759,7 @@
       </w:r>
       <w:r>
         <w:rPr>
-          <w:rFonts w:ascii="Times New Roman" w:hAnsi="Times New Roman" w:eastAsia="宋体"/>
+          <w:rFonts w:ascii="Arial" w:hAnsi="Arial" w:eastAsia="PingFang SC"/>
           <w:b w:val="0"/>
           <w:i w:val="0"/>
           <w:sz w:val="24"/>
@@ -775,7 +775,7 @@
       </w:pPr>
       <w:r>
         <w:rPr>
-          <w:rFonts w:ascii="Times New Roman" w:hAnsi="Times New Roman" w:eastAsia="宋体"/>
+          <w:rFonts w:ascii="Arial" w:hAnsi="Arial" w:eastAsia="PingFang SC"/>
           <w:b/>
           <w:i w:val="0"/>
           <w:sz w:val="24"/>
@@ -784,7 +784,7 @@
       </w:r>
       <w:r>
         <w:rPr>
-          <w:rFonts w:ascii="Times New Roman" w:hAnsi="Times New Roman" w:eastAsia="宋体"/>
+          <w:rFonts w:ascii="Arial" w:hAnsi="Arial" w:eastAsia="PingFang SC"/>
           <w:b w:val="0"/>
           <w:i w:val="0"/>
           <w:sz w:val="24"/>
@@ -800,7 +800,7 @@
       </w:pPr>
       <w:r>
         <w:rPr>
-          <w:rFonts w:ascii="Times New Roman" w:hAnsi="Times New Roman" w:eastAsia="宋体"/>
+          <w:rFonts w:ascii="Arial" w:hAnsi="Arial" w:eastAsia="PingFang SC"/>
           <w:b/>
           <w:i w:val="0"/>
           <w:sz w:val="24"/>
@@ -809,7 +809,7 @@
       </w:r>
       <w:r>
         <w:rPr>
-          <w:rFonts w:ascii="Times New Roman" w:hAnsi="Times New Roman" w:eastAsia="宋体"/>
+          <w:rFonts w:ascii="Arial" w:hAnsi="Arial" w:eastAsia="PingFang SC"/>
           <w:b w:val="0"/>
           <w:i w:val="0"/>
           <w:sz w:val="24"/>
@@ -825,7 +825,7 @@
       </w:pPr>
       <w:r>
         <w:rPr>
-          <w:rFonts w:ascii="Times New Roman" w:hAnsi="Times New Roman" w:eastAsia="宋体"/>
+          <w:rFonts w:ascii="Arial" w:hAnsi="Arial" w:eastAsia="PingFang SC"/>
           <w:b/>
           <w:i w:val="0"/>
           <w:sz w:val="24"/>
@@ -834,7 +834,7 @@
       </w:r>
       <w:r>
         <w:rPr>
-          <w:rFonts w:ascii="Times New Roman" w:hAnsi="Times New Roman" w:eastAsia="宋体"/>
+          <w:rFonts w:ascii="Arial" w:hAnsi="Arial" w:eastAsia="PingFang SC"/>
           <w:b w:val="0"/>
           <w:i w:val="0"/>
           <w:sz w:val="24"/>
@@ -861,7 +861,7 @@
       </w:pPr>
       <w:r>
         <w:rPr>
-          <w:rFonts w:ascii="Arial" w:hAnsi="Arial" w:eastAsia="黑体"/>
+          <w:rFonts w:ascii="Arial" w:hAnsi="Arial" w:eastAsia="PingFang SC"/>
           <w:b/>
           <w:i w:val="0"/>
           <w:color w:val="000000"/>
@@ -877,7 +877,7 @@
       </w:pPr>
       <w:r>
         <w:rPr>
-          <w:rFonts w:ascii="Arial" w:hAnsi="Arial" w:eastAsia="黑体"/>
+          <w:rFonts w:ascii="Arial" w:hAnsi="Arial" w:eastAsia="PingFang SC"/>
           <w:b/>
           <w:i w:val="0"/>
           <w:color w:val="333333"/>
@@ -915,7 +915,7 @@
             </w:pPr>
             <w:r>
               <w:rPr>
-                <w:rFonts w:ascii="Times New Roman" w:hAnsi="Times New Roman" w:eastAsia="宋体"/>
+                <w:rFonts w:ascii="Arial" w:hAnsi="Arial" w:eastAsia="PingFang SC"/>
                 <w:b/>
                 <w:i w:val="0"/>
                 <w:sz w:val="22"/>
@@ -941,7 +941,7 @@
             </w:pPr>
             <w:r>
               <w:rPr>
-                <w:rFonts w:ascii="Times New Roman" w:hAnsi="Times New Roman" w:eastAsia="宋体"/>
+                <w:rFonts w:ascii="Arial" w:hAnsi="Arial" w:eastAsia="PingFang SC"/>
                 <w:b/>
                 <w:i w:val="0"/>
                 <w:sz w:val="22"/>
@@ -967,7 +967,7 @@
             </w:pPr>
             <w:r>
               <w:rPr>
-                <w:rFonts w:ascii="Times New Roman" w:hAnsi="Times New Roman" w:eastAsia="宋体"/>
+                <w:rFonts w:ascii="Arial" w:hAnsi="Arial" w:eastAsia="PingFang SC"/>
                 <w:b/>
                 <w:i w:val="0"/>
                 <w:sz w:val="22"/>
@@ -995,7 +995,7 @@
             </w:pPr>
             <w:r>
               <w:rPr>
-                <w:rFonts w:ascii="Times New Roman" w:hAnsi="Times New Roman" w:eastAsia="宋体"/>
+                <w:rFonts w:ascii="Arial" w:hAnsi="Arial" w:eastAsia="PingFang SC"/>
                 <w:b w:val="0"/>
                 <w:i w:val="0"/>
                 <w:sz w:val="22"/>
@@ -1021,7 +1021,7 @@
             </w:pPr>
             <w:r>
               <w:rPr>
-                <w:rFonts w:ascii="Times New Roman" w:hAnsi="Times New Roman" w:eastAsia="宋体"/>
+                <w:rFonts w:ascii="Arial" w:hAnsi="Arial" w:eastAsia="PingFang SC"/>
                 <w:b w:val="0"/>
                 <w:i w:val="0"/>
                 <w:sz w:val="22"/>
@@ -1047,7 +1047,7 @@
             </w:pPr>
             <w:r>
               <w:rPr>
-                <w:rFonts w:ascii="Times New Roman" w:hAnsi="Times New Roman" w:eastAsia="宋体"/>
+                <w:rFonts w:ascii="Arial" w:hAnsi="Arial" w:eastAsia="PingFang SC"/>
                 <w:b w:val="0"/>
                 <w:i w:val="0"/>
                 <w:sz w:val="22"/>
@@ -1075,7 +1075,7 @@
             </w:pPr>
             <w:r>
               <w:rPr>
-                <w:rFonts w:ascii="Times New Roman" w:hAnsi="Times New Roman" w:eastAsia="宋体"/>
+                <w:rFonts w:ascii="Arial" w:hAnsi="Arial" w:eastAsia="PingFang SC"/>
                 <w:b w:val="0"/>
                 <w:i w:val="0"/>
                 <w:sz w:val="22"/>
@@ -1101,7 +1101,7 @@
             </w:pPr>
             <w:r>
               <w:rPr>
-                <w:rFonts w:ascii="Times New Roman" w:hAnsi="Times New Roman" w:eastAsia="宋体"/>
+                <w:rFonts w:ascii="Arial" w:hAnsi="Arial" w:eastAsia="PingFang SC"/>
                 <w:b w:val="0"/>
                 <w:i w:val="0"/>
                 <w:sz w:val="22"/>
@@ -1127,7 +1127,7 @@
             </w:pPr>
             <w:r>
               <w:rPr>
-                <w:rFonts w:ascii="Times New Roman" w:hAnsi="Times New Roman" w:eastAsia="宋体"/>
+                <w:rFonts w:ascii="Arial" w:hAnsi="Arial" w:eastAsia="PingFang SC"/>
                 <w:b w:val="0"/>
                 <w:i w:val="0"/>
                 <w:sz w:val="22"/>
@@ -1155,7 +1155,7 @@
             </w:pPr>
             <w:r>
               <w:rPr>
-                <w:rFonts w:ascii="Times New Roman" w:hAnsi="Times New Roman" w:eastAsia="宋体"/>
+                <w:rFonts w:ascii="Arial" w:hAnsi="Arial" w:eastAsia="PingFang SC"/>
                 <w:b w:val="0"/>
                 <w:i w:val="0"/>
                 <w:sz w:val="22"/>
@@ -1181,7 +1181,7 @@
             </w:pPr>
             <w:r>
               <w:rPr>
-                <w:rFonts w:ascii="Times New Roman" w:hAnsi="Times New Roman" w:eastAsia="宋体"/>
+                <w:rFonts w:ascii="Arial" w:hAnsi="Arial" w:eastAsia="PingFang SC"/>
                 <w:b w:val="0"/>
                 <w:i w:val="0"/>
                 <w:sz w:val="22"/>
@@ -1207,7 +1207,7 @@
             </w:pPr>
             <w:r>
               <w:rPr>
-                <w:rFonts w:ascii="Times New Roman" w:hAnsi="Times New Roman" w:eastAsia="宋体"/>
+                <w:rFonts w:ascii="Arial" w:hAnsi="Arial" w:eastAsia="PingFang SC"/>
                 <w:b w:val="0"/>
                 <w:i w:val="0"/>
                 <w:sz w:val="22"/>
@@ -1235,7 +1235,7 @@
             </w:pPr>
             <w:r>
               <w:rPr>
-                <w:rFonts w:ascii="Times New Roman" w:hAnsi="Times New Roman" w:eastAsia="宋体"/>
+                <w:rFonts w:ascii="Arial" w:hAnsi="Arial" w:eastAsia="PingFang SC"/>
                 <w:b w:val="0"/>
                 <w:i w:val="0"/>
                 <w:sz w:val="22"/>
@@ -1261,7 +1261,7 @@
             </w:pPr>
             <w:r>
               <w:rPr>
-                <w:rFonts w:ascii="Times New Roman" w:hAnsi="Times New Roman" w:eastAsia="宋体"/>
+                <w:rFonts w:ascii="Arial" w:hAnsi="Arial" w:eastAsia="PingFang SC"/>
                 <w:b w:val="0"/>
                 <w:i w:val="0"/>
                 <w:sz w:val="22"/>
@@ -1287,7 +1287,7 @@
             </w:pPr>
             <w:r>
               <w:rPr>
-                <w:rFonts w:ascii="Times New Roman" w:hAnsi="Times New Roman" w:eastAsia="宋体"/>
+                <w:rFonts w:ascii="Arial" w:hAnsi="Arial" w:eastAsia="PingFang SC"/>
                 <w:b w:val="0"/>
                 <w:i w:val="0"/>
                 <w:sz w:val="22"/>
@@ -1315,7 +1315,7 @@
             </w:pPr>
             <w:r>
               <w:rPr>
-                <w:rFonts w:ascii="Times New Roman" w:hAnsi="Times New Roman" w:eastAsia="宋体"/>
+                <w:rFonts w:ascii="Arial" w:hAnsi="Arial" w:eastAsia="PingFang SC"/>
                 <w:b w:val="0"/>
                 <w:i w:val="0"/>
                 <w:sz w:val="22"/>
@@ -1341,7 +1341,7 @@
             </w:pPr>
             <w:r>
               <w:rPr>
-                <w:rFonts w:ascii="Times New Roman" w:hAnsi="Times New Roman" w:eastAsia="宋体"/>
+                <w:rFonts w:ascii="Arial" w:hAnsi="Arial" w:eastAsia="PingFang SC"/>
                 <w:b w:val="0"/>
                 <w:i w:val="0"/>
                 <w:sz w:val="22"/>
@@ -1367,7 +1367,7 @@
             </w:pPr>
             <w:r>
               <w:rPr>
-                <w:rFonts w:ascii="Times New Roman" w:hAnsi="Times New Roman" w:eastAsia="宋体"/>
+                <w:rFonts w:ascii="Arial" w:hAnsi="Arial" w:eastAsia="PingFang SC"/>
                 <w:b w:val="0"/>
                 <w:i w:val="0"/>
                 <w:sz w:val="22"/>
@@ -1395,7 +1395,7 @@
             </w:pPr>
             <w:r>
               <w:rPr>
-                <w:rFonts w:ascii="Times New Roman" w:hAnsi="Times New Roman" w:eastAsia="宋体"/>
+                <w:rFonts w:ascii="Arial" w:hAnsi="Arial" w:eastAsia="PingFang SC"/>
                 <w:b w:val="0"/>
                 <w:i w:val="0"/>
                 <w:sz w:val="22"/>
@@ -1421,7 +1421,7 @@
             </w:pPr>
             <w:r>
               <w:rPr>
-                <w:rFonts w:ascii="Times New Roman" w:hAnsi="Times New Roman" w:eastAsia="宋体"/>
+                <w:rFonts w:ascii="Arial" w:hAnsi="Arial" w:eastAsia="PingFang SC"/>
                 <w:b w:val="0"/>
                 <w:i w:val="0"/>
                 <w:sz w:val="22"/>
@@ -1447,7 +1447,7 @@
             </w:pPr>
             <w:r>
               <w:rPr>
-                <w:rFonts w:ascii="Times New Roman" w:hAnsi="Times New Roman" w:eastAsia="宋体"/>
+                <w:rFonts w:ascii="Arial" w:hAnsi="Arial" w:eastAsia="PingFang SC"/>
                 <w:b w:val="0"/>
                 <w:i w:val="0"/>
                 <w:sz w:val="22"/>
@@ -1475,7 +1475,7 @@
             </w:pPr>
             <w:r>
               <w:rPr>
-                <w:rFonts w:ascii="Times New Roman" w:hAnsi="Times New Roman" w:eastAsia="宋体"/>
+                <w:rFonts w:ascii="Arial" w:hAnsi="Arial" w:eastAsia="PingFang SC"/>
                 <w:b w:val="0"/>
                 <w:i w:val="0"/>
                 <w:sz w:val="22"/>
@@ -1501,7 +1501,7 @@
             </w:pPr>
             <w:r>
               <w:rPr>
-                <w:rFonts w:ascii="Times New Roman" w:hAnsi="Times New Roman" w:eastAsia="宋体"/>
+                <w:rFonts w:ascii="Arial" w:hAnsi="Arial" w:eastAsia="PingFang SC"/>
                 <w:b w:val="0"/>
                 <w:i w:val="0"/>
                 <w:sz w:val="22"/>
@@ -1527,7 +1527,7 @@
             </w:pPr>
             <w:r>
               <w:rPr>
-                <w:rFonts w:ascii="Times New Roman" w:hAnsi="Times New Roman" w:eastAsia="宋体"/>
+                <w:rFonts w:ascii="Arial" w:hAnsi="Arial" w:eastAsia="PingFang SC"/>
                 <w:b w:val="0"/>
                 <w:i w:val="0"/>
                 <w:sz w:val="22"/>
@@ -1555,7 +1555,7 @@
             </w:pPr>
             <w:r>
               <w:rPr>
-                <w:rFonts w:ascii="Times New Roman" w:hAnsi="Times New Roman" w:eastAsia="宋体"/>
+                <w:rFonts w:ascii="Arial" w:hAnsi="Arial" w:eastAsia="PingFang SC"/>
                 <w:b w:val="0"/>
                 <w:i w:val="0"/>
                 <w:sz w:val="22"/>
@@ -1581,7 +1581,7 @@
             </w:pPr>
             <w:r>
               <w:rPr>
-                <w:rFonts w:ascii="Times New Roman" w:hAnsi="Times New Roman" w:eastAsia="宋体"/>
+                <w:rFonts w:ascii="Arial" w:hAnsi="Arial" w:eastAsia="PingFang SC"/>
                 <w:b w:val="0"/>
                 <w:i w:val="0"/>
                 <w:sz w:val="22"/>
@@ -1607,7 +1607,7 @@
             </w:pPr>
             <w:r>
               <w:rPr>
-                <w:rFonts w:ascii="Times New Roman" w:hAnsi="Times New Roman" w:eastAsia="宋体"/>
+                <w:rFonts w:ascii="Arial" w:hAnsi="Arial" w:eastAsia="PingFang SC"/>
                 <w:b w:val="0"/>
                 <w:i w:val="0"/>
                 <w:sz w:val="22"/>
@@ -1635,7 +1635,7 @@
             </w:pPr>
             <w:r>
               <w:rPr>
-                <w:rFonts w:ascii="Times New Roman" w:hAnsi="Times New Roman" w:eastAsia="宋体"/>
+                <w:rFonts w:ascii="Arial" w:hAnsi="Arial" w:eastAsia="PingFang SC"/>
                 <w:b w:val="0"/>
                 <w:i w:val="0"/>
                 <w:sz w:val="22"/>
@@ -1661,7 +1661,7 @@
             </w:pPr>
             <w:r>
               <w:rPr>
-                <w:rFonts w:ascii="Times New Roman" w:hAnsi="Times New Roman" w:eastAsia="宋体"/>
+                <w:rFonts w:ascii="Arial" w:hAnsi="Arial" w:eastAsia="PingFang SC"/>
                 <w:b w:val="0"/>
                 <w:i w:val="0"/>
                 <w:sz w:val="22"/>
@@ -1687,7 +1687,7 @@
             </w:pPr>
             <w:r>
               <w:rPr>
-                <w:rFonts w:ascii="Times New Roman" w:hAnsi="Times New Roman" w:eastAsia="宋体"/>
+                <w:rFonts w:ascii="Arial" w:hAnsi="Arial" w:eastAsia="PingFang SC"/>
                 <w:b w:val="0"/>
                 <w:i w:val="0"/>
                 <w:sz w:val="22"/>
@@ -1715,7 +1715,7 @@
             </w:pPr>
             <w:r>
               <w:rPr>
-                <w:rFonts w:ascii="Times New Roman" w:hAnsi="Times New Roman" w:eastAsia="宋体"/>
+                <w:rFonts w:ascii="Arial" w:hAnsi="Arial" w:eastAsia="PingFang SC"/>
                 <w:b w:val="0"/>
                 <w:i w:val="0"/>
                 <w:sz w:val="22"/>
@@ -1741,7 +1741,7 @@
             </w:pPr>
             <w:r>
               <w:rPr>
-                <w:rFonts w:ascii="Times New Roman" w:hAnsi="Times New Roman" w:eastAsia="宋体"/>
+                <w:rFonts w:ascii="Arial" w:hAnsi="Arial" w:eastAsia="PingFang SC"/>
                 <w:b w:val="0"/>
                 <w:i w:val="0"/>
                 <w:sz w:val="22"/>
@@ -1767,7 +1767,7 @@
             </w:pPr>
             <w:r>
               <w:rPr>
-                <w:rFonts w:ascii="Times New Roman" w:hAnsi="Times New Roman" w:eastAsia="宋体"/>
+                <w:rFonts w:ascii="Arial" w:hAnsi="Arial" w:eastAsia="PingFang SC"/>
                 <w:b w:val="0"/>
                 <w:i w:val="0"/>
                 <w:sz w:val="22"/>
@@ -1795,7 +1795,7 @@
             </w:pPr>
             <w:r>
               <w:rPr>
-                <w:rFonts w:ascii="Times New Roman" w:hAnsi="Times New Roman" w:eastAsia="宋体"/>
+                <w:rFonts w:ascii="Arial" w:hAnsi="Arial" w:eastAsia="PingFang SC"/>
                 <w:b w:val="0"/>
                 <w:i w:val="0"/>
                 <w:sz w:val="22"/>
@@ -1821,7 +1821,7 @@
             </w:pPr>
             <w:r>
               <w:rPr>
-                <w:rFonts w:ascii="Times New Roman" w:hAnsi="Times New Roman" w:eastAsia="宋体"/>
+                <w:rFonts w:ascii="Arial" w:hAnsi="Arial" w:eastAsia="PingFang SC"/>
                 <w:b w:val="0"/>
                 <w:i w:val="0"/>
                 <w:sz w:val="22"/>
@@ -1847,7 +1847,7 @@
             </w:pPr>
             <w:r>
               <w:rPr>
-                <w:rFonts w:ascii="Times New Roman" w:hAnsi="Times New Roman" w:eastAsia="宋体"/>
+                <w:rFonts w:ascii="Arial" w:hAnsi="Arial" w:eastAsia="PingFang SC"/>
                 <w:b w:val="0"/>
                 <w:i w:val="0"/>
                 <w:sz w:val="22"/>
@@ -1875,7 +1875,7 @@
             </w:pPr>
             <w:r>
               <w:rPr>
-                <w:rFonts w:ascii="Times New Roman" w:hAnsi="Times New Roman" w:eastAsia="宋体"/>
+                <w:rFonts w:ascii="Arial" w:hAnsi="Arial" w:eastAsia="PingFang SC"/>
                 <w:b w:val="0"/>
                 <w:i w:val="0"/>
                 <w:sz w:val="22"/>
@@ -1901,7 +1901,7 @@
             </w:pPr>
             <w:r>
               <w:rPr>
-                <w:rFonts w:ascii="Times New Roman" w:hAnsi="Times New Roman" w:eastAsia="宋体"/>
+                <w:rFonts w:ascii="Arial" w:hAnsi="Arial" w:eastAsia="PingFang SC"/>
                 <w:b w:val="0"/>
                 <w:i w:val="0"/>
                 <w:sz w:val="22"/>
@@ -1927,7 +1927,7 @@
             </w:pPr>
             <w:r>
               <w:rPr>
-                <w:rFonts w:ascii="Times New Roman" w:hAnsi="Times New Roman" w:eastAsia="宋体"/>
+                <w:rFonts w:ascii="Arial" w:hAnsi="Arial" w:eastAsia="PingFang SC"/>
                 <w:b w:val="0"/>
                 <w:i w:val="0"/>
                 <w:sz w:val="22"/>
@@ -1955,7 +1955,7 @@
             </w:pPr>
             <w:r>
               <w:rPr>
-                <w:rFonts w:ascii="Times New Roman" w:hAnsi="Times New Roman" w:eastAsia="宋体"/>
+                <w:rFonts w:ascii="Arial" w:hAnsi="Arial" w:eastAsia="PingFang SC"/>
                 <w:b w:val="0"/>
                 <w:i w:val="0"/>
                 <w:sz w:val="22"/>
@@ -1981,7 +1981,7 @@
             </w:pPr>
             <w:r>
               <w:rPr>
-                <w:rFonts w:ascii="Times New Roman" w:hAnsi="Times New Roman" w:eastAsia="宋体"/>
+                <w:rFonts w:ascii="Arial" w:hAnsi="Arial" w:eastAsia="PingFang SC"/>
                 <w:b w:val="0"/>
                 <w:i w:val="0"/>
                 <w:sz w:val="22"/>
@@ -2007,7 +2007,7 @@
             </w:pPr>
             <w:r>
               <w:rPr>
-                <w:rFonts w:ascii="Times New Roman" w:hAnsi="Times New Roman" w:eastAsia="宋体"/>
+                <w:rFonts w:ascii="Arial" w:hAnsi="Arial" w:eastAsia="PingFang SC"/>
                 <w:b w:val="0"/>
                 <w:i w:val="0"/>
                 <w:sz w:val="22"/>
@@ -2026,7 +2026,7 @@
       </w:pPr>
       <w:r>
         <w:rPr>
-          <w:rFonts w:ascii="Arial" w:hAnsi="Arial" w:eastAsia="黑体"/>
+          <w:rFonts w:ascii="Arial" w:hAnsi="Arial" w:eastAsia="PingFang SC"/>
           <w:b/>
           <w:i w:val="0"/>
           <w:color w:val="333333"/>
@@ -2066,7 +2066,7 @@
             </w:pPr>
             <w:r>
               <w:rPr>
-                <w:rFonts w:ascii="Times New Roman" w:hAnsi="Times New Roman" w:eastAsia="宋体"/>
+                <w:rFonts w:ascii="Arial" w:hAnsi="Arial" w:eastAsia="PingFang SC"/>
                 <w:b/>
                 <w:i w:val="0"/>
                 <w:sz w:val="22"/>
@@ -2092,7 +2092,7 @@
             </w:pPr>
             <w:r>
               <w:rPr>
-                <w:rFonts w:ascii="Times New Roman" w:hAnsi="Times New Roman" w:eastAsia="宋体"/>
+                <w:rFonts w:ascii="Arial" w:hAnsi="Arial" w:eastAsia="PingFang SC"/>
                 <w:b/>
                 <w:i w:val="0"/>
                 <w:sz w:val="22"/>
@@ -2118,7 +2118,7 @@
             </w:pPr>
             <w:r>
               <w:rPr>
-                <w:rFonts w:ascii="Times New Roman" w:hAnsi="Times New Roman" w:eastAsia="宋体"/>
+                <w:rFonts w:ascii="Arial" w:hAnsi="Arial" w:eastAsia="PingFang SC"/>
                 <w:b/>
                 <w:i w:val="0"/>
                 <w:sz w:val="22"/>
@@ -2144,7 +2144,7 @@
             </w:pPr>
             <w:r>
               <w:rPr>
-                <w:rFonts w:ascii="Times New Roman" w:hAnsi="Times New Roman" w:eastAsia="宋体"/>
+                <w:rFonts w:ascii="Arial" w:hAnsi="Arial" w:eastAsia="PingFang SC"/>
                 <w:b/>
                 <w:i w:val="0"/>
                 <w:sz w:val="22"/>
@@ -2170,7 +2170,7 @@
             </w:pPr>
             <w:r>
               <w:rPr>
-                <w:rFonts w:ascii="Times New Roman" w:hAnsi="Times New Roman" w:eastAsia="宋体"/>
+                <w:rFonts w:ascii="Arial" w:hAnsi="Arial" w:eastAsia="PingFang SC"/>
                 <w:b/>
                 <w:i w:val="0"/>
                 <w:sz w:val="22"/>
@@ -2198,7 +2198,7 @@
             </w:pPr>
             <w:r>
               <w:rPr>
-                <w:rFonts w:ascii="Times New Roman" w:hAnsi="Times New Roman" w:eastAsia="宋体"/>
+                <w:rFonts w:ascii="Arial" w:hAnsi="Arial" w:eastAsia="PingFang SC"/>
                 <w:b w:val="0"/>
                 <w:i w:val="0"/>
                 <w:sz w:val="22"/>
@@ -2224,7 +2224,7 @@
             </w:pPr>
             <w:r>
               <w:rPr>
-                <w:rFonts w:ascii="Times New Roman" w:hAnsi="Times New Roman" w:eastAsia="宋体"/>
+                <w:rFonts w:ascii="Arial" w:hAnsi="Arial" w:eastAsia="PingFang SC"/>
                 <w:b w:val="0"/>
                 <w:i w:val="0"/>
                 <w:sz w:val="22"/>
@@ -2250,7 +2250,7 @@
             </w:pPr>
             <w:r>
               <w:rPr>
-                <w:rFonts w:ascii="Times New Roman" w:hAnsi="Times New Roman" w:eastAsia="宋体"/>
+                <w:rFonts w:ascii="Arial" w:hAnsi="Arial" w:eastAsia="PingFang SC"/>
                 <w:b w:val="0"/>
                 <w:i w:val="0"/>
                 <w:sz w:val="22"/>
@@ -2276,7 +2276,7 @@
             </w:pPr>
             <w:r>
               <w:rPr>
-                <w:rFonts w:ascii="Times New Roman" w:hAnsi="Times New Roman" w:eastAsia="宋体"/>
+                <w:rFonts w:ascii="Arial" w:hAnsi="Arial" w:eastAsia="PingFang SC"/>
                 <w:b w:val="0"/>
                 <w:i w:val="0"/>
                 <w:sz w:val="22"/>
@@ -2302,7 +2302,7 @@
             </w:pPr>
             <w:r>
               <w:rPr>
-                <w:rFonts w:ascii="Times New Roman" w:hAnsi="Times New Roman" w:eastAsia="宋体"/>
+                <w:rFonts w:ascii="Arial" w:hAnsi="Arial" w:eastAsia="PingFang SC"/>
                 <w:b w:val="0"/>
                 <w:i w:val="0"/>
                 <w:sz w:val="22"/>
@@ -2330,7 +2330,7 @@
             </w:pPr>
             <w:r>
               <w:rPr>
-                <w:rFonts w:ascii="Times New Roman" w:hAnsi="Times New Roman" w:eastAsia="宋体"/>
+                <w:rFonts w:ascii="Arial" w:hAnsi="Arial" w:eastAsia="PingFang SC"/>
                 <w:b w:val="0"/>
                 <w:i w:val="0"/>
                 <w:sz w:val="22"/>
@@ -2356,7 +2356,7 @@
             </w:pPr>
             <w:r>
               <w:rPr>
-                <w:rFonts w:ascii="Times New Roman" w:hAnsi="Times New Roman" w:eastAsia="宋体"/>
+                <w:rFonts w:ascii="Arial" w:hAnsi="Arial" w:eastAsia="PingFang SC"/>
                 <w:b w:val="0"/>
                 <w:i w:val="0"/>
                 <w:sz w:val="22"/>
@@ -2382,7 +2382,7 @@
             </w:pPr>
             <w:r>
               <w:rPr>
-                <w:rFonts w:ascii="Times New Roman" w:hAnsi="Times New Roman" w:eastAsia="宋体"/>
+                <w:rFonts w:ascii="Arial" w:hAnsi="Arial" w:eastAsia="PingFang SC"/>
                 <w:b w:val="0"/>
                 <w:i w:val="0"/>
                 <w:sz w:val="22"/>
@@ -2408,7 +2408,7 @@
             </w:pPr>
             <w:r>
               <w:rPr>
-                <w:rFonts w:ascii="Times New Roman" w:hAnsi="Times New Roman" w:eastAsia="宋体"/>
+                <w:rFonts w:ascii="Arial" w:hAnsi="Arial" w:eastAsia="PingFang SC"/>
                 <w:b w:val="0"/>
                 <w:i w:val="0"/>
                 <w:sz w:val="22"/>
@@ -2434,7 +2434,7 @@
             </w:pPr>
             <w:r>
               <w:rPr>
-                <w:rFonts w:ascii="Times New Roman" w:hAnsi="Times New Roman" w:eastAsia="宋体"/>
+                <w:rFonts w:ascii="Arial" w:hAnsi="Arial" w:eastAsia="PingFang SC"/>
                 <w:b w:val="0"/>
                 <w:i w:val="0"/>
                 <w:sz w:val="22"/>
@@ -2462,7 +2462,7 @@
             </w:pPr>
             <w:r>
               <w:rPr>
-                <w:rFonts w:ascii="Times New Roman" w:hAnsi="Times New Roman" w:eastAsia="宋体"/>
+                <w:rFonts w:ascii="Arial" w:hAnsi="Arial" w:eastAsia="PingFang SC"/>
                 <w:b w:val="0"/>
                 <w:i w:val="0"/>
                 <w:sz w:val="22"/>
@@ -2488,7 +2488,7 @@
             </w:pPr>
             <w:r>
               <w:rPr>
-                <w:rFonts w:ascii="Times New Roman" w:hAnsi="Times New Roman" w:eastAsia="宋体"/>
+                <w:rFonts w:ascii="Arial" w:hAnsi="Arial" w:eastAsia="PingFang SC"/>
                 <w:b w:val="0"/>
                 <w:i w:val="0"/>
                 <w:sz w:val="22"/>
@@ -2514,7 +2514,7 @@
             </w:pPr>
             <w:r>
               <w:rPr>
-                <w:rFonts w:ascii="Times New Roman" w:hAnsi="Times New Roman" w:eastAsia="宋体"/>
+                <w:rFonts w:ascii="Arial" w:hAnsi="Arial" w:eastAsia="PingFang SC"/>
                 <w:b w:val="0"/>
                 <w:i w:val="0"/>
                 <w:sz w:val="22"/>
@@ -2540,7 +2540,7 @@
             </w:pPr>
             <w:r>
               <w:rPr>
-                <w:rFonts w:ascii="Times New Roman" w:hAnsi="Times New Roman" w:eastAsia="宋体"/>
+                <w:rFonts w:ascii="Arial" w:hAnsi="Arial" w:eastAsia="PingFang SC"/>
                 <w:b w:val="0"/>
                 <w:i w:val="0"/>
                 <w:sz w:val="22"/>
@@ -2566,7 +2566,7 @@
             </w:pPr>
             <w:r>
               <w:rPr>
-                <w:rFonts w:ascii="Times New Roman" w:hAnsi="Times New Roman" w:eastAsia="宋体"/>
+                <w:rFonts w:ascii="Arial" w:hAnsi="Arial" w:eastAsia="PingFang SC"/>
                 <w:b/>
                 <w:i w:val="0"/>
                 <w:sz w:val="22"/>
@@ -2594,7 +2594,7 @@
             </w:pPr>
             <w:r>
               <w:rPr>
-                <w:rFonts w:ascii="Times New Roman" w:hAnsi="Times New Roman" w:eastAsia="宋体"/>
+                <w:rFonts w:ascii="Arial" w:hAnsi="Arial" w:eastAsia="PingFang SC"/>
                 <w:b w:val="0"/>
                 <w:i w:val="0"/>
                 <w:sz w:val="22"/>
@@ -2620,7 +2620,7 @@
             </w:pPr>
             <w:r>
               <w:rPr>
-                <w:rFonts w:ascii="Times New Roman" w:hAnsi="Times New Roman" w:eastAsia="宋体"/>
+                <w:rFonts w:ascii="Arial" w:hAnsi="Arial" w:eastAsia="PingFang SC"/>
                 <w:b w:val="0"/>
                 <w:i w:val="0"/>
                 <w:sz w:val="22"/>
@@ -2646,7 +2646,7 @@
             </w:pPr>
             <w:r>
               <w:rPr>
-                <w:rFonts w:ascii="Times New Roman" w:hAnsi="Times New Roman" w:eastAsia="宋体"/>
+                <w:rFonts w:ascii="Arial" w:hAnsi="Arial" w:eastAsia="PingFang SC"/>
                 <w:b w:val="0"/>
                 <w:i w:val="0"/>
                 <w:sz w:val="22"/>
@@ -2672,7 +2672,7 @@
             </w:pPr>
             <w:r>
               <w:rPr>
-                <w:rFonts w:ascii="Times New Roman" w:hAnsi="Times New Roman" w:eastAsia="宋体"/>
+                <w:rFonts w:ascii="Arial" w:hAnsi="Arial" w:eastAsia="PingFang SC"/>
                 <w:b w:val="0"/>
                 <w:i w:val="0"/>
                 <w:sz w:val="22"/>
@@ -2698,7 +2698,7 @@
             </w:pPr>
             <w:r>
               <w:rPr>
-                <w:rFonts w:ascii="Times New Roman" w:hAnsi="Times New Roman" w:eastAsia="宋体"/>
+                <w:rFonts w:ascii="Arial" w:hAnsi="Arial" w:eastAsia="PingFang SC"/>
                 <w:b w:val="0"/>
                 <w:i w:val="0"/>
                 <w:sz w:val="22"/>
@@ -2726,7 +2726,7 @@
             </w:pPr>
             <w:r>
               <w:rPr>
-                <w:rFonts w:ascii="Times New Roman" w:hAnsi="Times New Roman" w:eastAsia="宋体"/>
+                <w:rFonts w:ascii="Arial" w:hAnsi="Arial" w:eastAsia="PingFang SC"/>
                 <w:b w:val="0"/>
                 <w:i w:val="0"/>
                 <w:sz w:val="22"/>
@@ -2752,7 +2752,7 @@
             </w:pPr>
             <w:r>
               <w:rPr>
-                <w:rFonts w:ascii="Times New Roman" w:hAnsi="Times New Roman" w:eastAsia="宋体"/>
+                <w:rFonts w:ascii="Arial" w:hAnsi="Arial" w:eastAsia="PingFang SC"/>
                 <w:b w:val="0"/>
                 <w:i w:val="0"/>
                 <w:sz w:val="22"/>
@@ -2778,7 +2778,7 @@
             </w:pPr>
             <w:r>
               <w:rPr>
-                <w:rFonts w:ascii="Times New Roman" w:hAnsi="Times New Roman" w:eastAsia="宋体"/>
+                <w:rFonts w:ascii="Arial" w:hAnsi="Arial" w:eastAsia="PingFang SC"/>
                 <w:b w:val="0"/>
                 <w:i w:val="0"/>
                 <w:sz w:val="22"/>
@@ -2804,7 +2804,7 @@
             </w:pPr>
             <w:r>
               <w:rPr>
-                <w:rFonts w:ascii="Times New Roman" w:hAnsi="Times New Roman" w:eastAsia="宋体"/>
+                <w:rFonts w:ascii="Arial" w:hAnsi="Arial" w:eastAsia="PingFang SC"/>
                 <w:b w:val="0"/>
                 <w:i w:val="0"/>
                 <w:sz w:val="22"/>
@@ -2830,7 +2830,7 @@
             </w:pPr>
             <w:r>
               <w:rPr>
-                <w:rFonts w:ascii="Times New Roman" w:hAnsi="Times New Roman" w:eastAsia="宋体"/>
+                <w:rFonts w:ascii="Arial" w:hAnsi="Arial" w:eastAsia="PingFang SC"/>
                 <w:b w:val="0"/>
                 <w:i w:val="0"/>
                 <w:strike/>
@@ -2862,7 +2862,7 @@
       </w:pPr>
       <w:r>
         <w:rPr>
-          <w:rFonts w:ascii="Arial" w:hAnsi="Arial" w:eastAsia="黑体"/>
+          <w:rFonts w:ascii="Arial" w:hAnsi="Arial" w:eastAsia="PingFang SC"/>
           <w:b/>
           <w:i w:val="0"/>
           <w:color w:val="000000"/>
@@ -2878,7 +2878,7 @@
       </w:pPr>
       <w:r>
         <w:rPr>
-          <w:rFonts w:ascii="Arial" w:hAnsi="Arial" w:eastAsia="黑体"/>
+          <w:rFonts w:ascii="Arial" w:hAnsi="Arial" w:eastAsia="PingFang SC"/>
           <w:b/>
           <w:i w:val="0"/>
           <w:color w:val="333333"/>
@@ -2939,7 +2939,7 @@
       </w:pPr>
       <w:r>
         <w:rPr>
-          <w:rFonts w:ascii="Arial" w:hAnsi="Arial" w:eastAsia="黑体"/>
+          <w:rFonts w:ascii="Arial" w:hAnsi="Arial" w:eastAsia="PingFang SC"/>
           <w:b/>
           <w:i w:val="0"/>
           <w:color w:val="333333"/>
@@ -2985,7 +2985,7 @@
       </w:pPr>
       <w:r>
         <w:rPr>
-          <w:rFonts w:ascii="Arial" w:hAnsi="Arial" w:eastAsia="黑体"/>
+          <w:rFonts w:ascii="Arial" w:hAnsi="Arial" w:eastAsia="PingFang SC"/>
           <w:b/>
           <w:i w:val="0"/>
           <w:color w:val="333333"/>
@@ -3049,7 +3049,7 @@
       </w:pPr>
       <w:r>
         <w:rPr>
-          <w:rFonts w:ascii="Arial" w:hAnsi="Arial" w:eastAsia="黑体"/>
+          <w:rFonts w:ascii="Arial" w:hAnsi="Arial" w:eastAsia="PingFang SC"/>
           <w:b/>
           <w:i w:val="0"/>
           <w:color w:val="333333"/>
@@ -3111,7 +3111,7 @@
       </w:pPr>
       <w:r>
         <w:rPr>
-          <w:rFonts w:ascii="Arial" w:hAnsi="Arial" w:eastAsia="黑体"/>
+          <w:rFonts w:ascii="Arial" w:hAnsi="Arial" w:eastAsia="PingFang SC"/>
           <w:b/>
           <w:i w:val="0"/>
           <w:color w:val="000000"/>
@@ -3128,7 +3128,7 @@
       </w:pPr>
       <w:r>
         <w:rPr>
-          <w:rFonts w:ascii="Times New Roman" w:hAnsi="Times New Roman" w:eastAsia="仿宋"/>
+          <w:rFonts w:ascii="Arial" w:hAnsi="Arial" w:eastAsia="PingFang SC"/>
           <w:b w:val="0"/>
           <w:i w:val="0"/>
           <w:color w:val="555555"/>
@@ -3145,7 +3145,7 @@
       </w:pPr>
       <w:r>
         <w:rPr>
-          <w:rFonts w:ascii="Times New Roman" w:hAnsi="Times New Roman" w:eastAsia="仿宋"/>
+          <w:rFonts w:ascii="Arial" w:hAnsi="Arial" w:eastAsia="PingFang SC"/>
           <w:b w:val="0"/>
           <w:i w:val="0"/>
           <w:color w:val="555555"/>
@@ -3162,7 +3162,7 @@
       </w:pPr>
       <w:r>
         <w:rPr>
-          <w:rFonts w:ascii="Times New Roman" w:hAnsi="Times New Roman" w:eastAsia="仿宋"/>
+          <w:rFonts w:ascii="Arial" w:hAnsi="Arial" w:eastAsia="PingFang SC"/>
           <w:b/>
           <w:i w:val="0"/>
           <w:color w:val="555555"/>
@@ -3172,7 +3172,7 @@
       </w:r>
       <w:r>
         <w:rPr>
-          <w:rFonts w:ascii="Times New Roman" w:hAnsi="Times New Roman" w:eastAsia="仿宋"/>
+          <w:rFonts w:ascii="Arial" w:hAnsi="Arial" w:eastAsia="PingFang SC"/>
           <w:b w:val="0"/>
           <w:i w:val="0"/>
           <w:color w:val="555555"/>
@@ -3182,7 +3182,7 @@
       </w:r>
       <w:r>
         <w:rPr>
-          <w:rFonts w:ascii="Times New Roman" w:hAnsi="Times New Roman" w:eastAsia="仿宋"/>
+          <w:rFonts w:ascii="Arial" w:hAnsi="Arial" w:eastAsia="PingFang SC"/>
           <w:b/>
           <w:i w:val="0"/>
           <w:color w:val="555555"/>
@@ -3192,7 +3192,7 @@
       </w:r>
       <w:r>
         <w:rPr>
-          <w:rFonts w:ascii="Times New Roman" w:hAnsi="Times New Roman" w:eastAsia="仿宋"/>
+          <w:rFonts w:ascii="Arial" w:hAnsi="Arial" w:eastAsia="PingFang SC"/>
           <w:b w:val="0"/>
           <w:i w:val="0"/>
           <w:color w:val="555555"/>
@@ -3202,7 +3202,7 @@
       </w:r>
       <w:r>
         <w:rPr>
-          <w:rFonts w:ascii="Times New Roman" w:hAnsi="Times New Roman" w:eastAsia="仿宋"/>
+          <w:rFonts w:ascii="Arial" w:hAnsi="Arial" w:eastAsia="PingFang SC"/>
           <w:b w:val="0"/>
           <w:i/>
           <w:color w:val="555555"/>
@@ -3212,7 +3212,7 @@
       </w:r>
       <w:r>
         <w:rPr>
-          <w:rFonts w:ascii="Times New Roman" w:hAnsi="Times New Roman" w:eastAsia="仿宋"/>
+          <w:rFonts w:ascii="Arial" w:hAnsi="Arial" w:eastAsia="PingFang SC"/>
           <w:b w:val="0"/>
           <w:i w:val="0"/>
           <w:color w:val="555555"/>
@@ -3229,7 +3229,7 @@
       </w:r>
       <w:r>
         <w:rPr>
-          <w:rFonts w:ascii="Times New Roman" w:hAnsi="Times New Roman" w:eastAsia="仿宋"/>
+          <w:rFonts w:ascii="Arial" w:hAnsi="Arial" w:eastAsia="PingFang SC"/>
           <w:b w:val="0"/>
           <w:i w:val="0"/>
           <w:color w:val="555555"/>
@@ -3257,7 +3257,7 @@
       </w:pPr>
       <w:r>
         <w:rPr>
-          <w:rFonts w:ascii="Arial" w:hAnsi="Arial" w:eastAsia="黑体"/>
+          <w:rFonts w:ascii="Arial" w:hAnsi="Arial" w:eastAsia="PingFang SC"/>
           <w:b/>
           <w:i w:val="0"/>
           <w:color w:val="000000"/>
@@ -3274,7 +3274,7 @@
       </w:pPr>
       <w:r>
         <w:rPr>
-          <w:rFonts w:ascii="Times New Roman" w:hAnsi="Times New Roman" w:eastAsia="宋体"/>
+          <w:rFonts w:ascii="Arial" w:hAnsi="Arial" w:eastAsia="PingFang SC"/>
           <w:b w:val="0"/>
           <w:i w:val="0"/>
           <w:sz w:val="24"/>
@@ -3330,7 +3330,7 @@
       </w:pPr>
       <w:r>
         <w:rPr>
-          <w:rFonts w:ascii="Times New Roman" w:hAnsi="Times New Roman" w:eastAsia="宋体"/>
+          <w:rFonts w:ascii="Arial" w:hAnsi="Arial" w:eastAsia="PingFang SC"/>
           <w:b w:val="0"/>
           <w:i w:val="0"/>
           <w:sz w:val="24"/>
@@ -3346,7 +3346,7 @@
       </w:r>
       <w:r>
         <w:rPr>
-          <w:rFonts w:ascii="Times New Roman" w:hAnsi="Times New Roman" w:eastAsia="宋体"/>
+          <w:rFonts w:ascii="Arial" w:hAnsi="Arial" w:eastAsia="PingFang SC"/>
           <w:b w:val="0"/>
           <w:i w:val="0"/>
           <w:sz w:val="24"/>
@@ -3373,7 +3373,7 @@
       </w:pPr>
       <w:r>
         <w:rPr>
-          <w:rFonts w:ascii="Arial" w:hAnsi="Arial" w:eastAsia="黑体"/>
+          <w:rFonts w:ascii="Arial" w:hAnsi="Arial" w:eastAsia="PingFang SC"/>
           <w:b/>
           <w:i w:val="0"/>
           <w:color w:val="000000"/>
@@ -3389,7 +3389,7 @@
       </w:pPr>
       <w:r>
         <w:rPr>
-          <w:rFonts w:ascii="Arial" w:hAnsi="Arial" w:eastAsia="黑体"/>
+          <w:rFonts w:ascii="Arial" w:hAnsi="Arial" w:eastAsia="PingFang SC"/>
           <w:b/>
           <w:i w:val="0"/>
           <w:color w:val="333333"/>
@@ -3445,7 +3445,7 @@
       </w:pPr>
       <w:r>
         <w:rPr>
-          <w:rFonts w:ascii="Arial" w:hAnsi="Arial" w:eastAsia="黑体"/>
+          <w:rFonts w:ascii="Arial" w:hAnsi="Arial" w:eastAsia="PingFang SC"/>
           <w:b/>
           <w:i w:val="0"/>
           <w:color w:val="333333"/>
@@ -3501,7 +3501,7 @@
       </w:pPr>
       <w:r>
         <w:rPr>
-          <w:rFonts w:ascii="Arial" w:hAnsi="Arial" w:eastAsia="黑体"/>
+          <w:rFonts w:ascii="Arial" w:hAnsi="Arial" w:eastAsia="PingFang SC"/>
           <w:b/>
           <w:i w:val="0"/>
           <w:color w:val="333333"/>
@@ -3557,7 +3557,7 @@
       </w:pPr>
       <w:r>
         <w:rPr>
-          <w:rFonts w:ascii="Arial" w:hAnsi="Arial" w:eastAsia="黑体"/>
+          <w:rFonts w:ascii="Arial" w:hAnsi="Arial" w:eastAsia="PingFang SC"/>
           <w:b/>
           <w:i w:val="0"/>
           <w:color w:val="333333"/>
@@ -3625,7 +3625,7 @@
       </w:pPr>
       <w:r>
         <w:rPr>
-          <w:rFonts w:ascii="Arial" w:hAnsi="Arial" w:eastAsia="黑体"/>
+          <w:rFonts w:ascii="Arial" w:hAnsi="Arial" w:eastAsia="PingFang SC"/>
           <w:b/>
           <w:i w:val="0"/>
           <w:color w:val="000000"/>
@@ -3642,7 +3642,7 @@
       </w:pPr>
       <w:r>
         <w:rPr>
-          <w:rFonts w:ascii="Times New Roman" w:hAnsi="Times New Roman" w:eastAsia="宋体"/>
+          <w:rFonts w:ascii="Arial" w:hAnsi="Arial" w:eastAsia="PingFang SC"/>
           <w:b w:val="0"/>
           <w:i w:val="0"/>
           <w:sz w:val="24"/>
@@ -3658,7 +3658,7 @@
       </w:pPr>
       <w:r>
         <w:rPr>
-          <w:rFonts w:ascii="Times New Roman" w:hAnsi="Times New Roman" w:eastAsia="宋体"/>
+          <w:rFonts w:ascii="Arial" w:hAnsi="Arial" w:eastAsia="PingFang SC"/>
           <w:b w:val="0"/>
           <w:i w:val="0"/>
           <w:sz w:val="24"/>
@@ -3667,7 +3667,7 @@
       </w:r>
       <w:r>
         <w:rPr>
-          <w:rFonts w:ascii="Times New Roman" w:hAnsi="Times New Roman" w:eastAsia="宋体"/>
+          <w:rFonts w:ascii="Arial" w:hAnsi="Arial" w:eastAsia="PingFang SC"/>
           <w:b/>
           <w:i w:val="0"/>
           <w:sz w:val="24"/>
@@ -3676,7 +3676,7 @@
       </w:r>
       <w:r>
         <w:rPr>
-          <w:rFonts w:ascii="Times New Roman" w:hAnsi="Times New Roman" w:eastAsia="宋体"/>
+          <w:rFonts w:ascii="Arial" w:hAnsi="Arial" w:eastAsia="PingFang SC"/>
           <w:b w:val="0"/>
           <w:i w:val="0"/>
           <w:sz w:val="24"/>
@@ -3692,7 +3692,7 @@
       </w:r>
       <w:r>
         <w:rPr>
-          <w:rFonts w:ascii="Times New Roman" w:hAnsi="Times New Roman" w:eastAsia="宋体"/>
+          <w:rFonts w:ascii="Arial" w:hAnsi="Arial" w:eastAsia="PingFang SC"/>
           <w:b w:val="0"/>
           <w:i w:val="0"/>
           <w:sz w:val="24"/>
@@ -3708,7 +3708,7 @@
       </w:r>
       <w:r>
         <w:rPr>
-          <w:rFonts w:ascii="Times New Roman" w:hAnsi="Times New Roman" w:eastAsia="宋体"/>
+          <w:rFonts w:ascii="Arial" w:hAnsi="Arial" w:eastAsia="PingFang SC"/>
           <w:b w:val="0"/>
           <w:i w:val="0"/>
           <w:sz w:val="24"/>
@@ -3724,7 +3724,7 @@
       </w:r>
       <w:r>
         <w:rPr>
-          <w:rFonts w:ascii="Times New Roman" w:hAnsi="Times New Roman" w:eastAsia="宋体"/>
+          <w:rFonts w:ascii="Arial" w:hAnsi="Arial" w:eastAsia="PingFang SC"/>
           <w:b w:val="0"/>
           <w:i w:val="0"/>
           <w:sz w:val="24"/>
@@ -3740,7 +3740,7 @@
       </w:r>
       <w:r>
         <w:rPr>
-          <w:rFonts w:ascii="Times New Roman" w:hAnsi="Times New Roman" w:eastAsia="宋体"/>
+          <w:rFonts w:ascii="Arial" w:hAnsi="Arial" w:eastAsia="PingFang SC"/>
           <w:b w:val="0"/>
           <w:i w:val="0"/>
           <w:sz w:val="24"/>
@@ -3756,7 +3756,7 @@
       </w:r>
       <w:r>
         <w:rPr>
-          <w:rFonts w:ascii="Times New Roman" w:hAnsi="Times New Roman" w:eastAsia="宋体"/>
+          <w:rFonts w:ascii="Arial" w:hAnsi="Arial" w:eastAsia="PingFang SC"/>
           <w:b w:val="0"/>
           <w:i w:val="0"/>
           <w:sz w:val="24"/>
@@ -3765,7 +3765,7 @@
       </w:r>
       <w:r>
         <w:rPr>
-          <w:rFonts w:ascii="Times New Roman" w:hAnsi="Times New Roman" w:eastAsia="宋体"/>
+          <w:rFonts w:ascii="Arial" w:hAnsi="Arial" w:eastAsia="PingFang SC"/>
           <w:b/>
           <w:i w:val="0"/>
           <w:sz w:val="24"/>
@@ -3774,7 +3774,7 @@
       </w:r>
       <w:r>
         <w:rPr>
-          <w:rFonts w:ascii="Times New Roman" w:hAnsi="Times New Roman" w:eastAsia="宋体"/>
+          <w:rFonts w:ascii="Arial" w:hAnsi="Arial" w:eastAsia="PingFang SC"/>
           <w:b w:val="0"/>
           <w:i w:val="0"/>
           <w:sz w:val="24"/>
@@ -3783,7 +3783,7 @@
       </w:r>
       <w:r>
         <w:rPr>
-          <w:rFonts w:ascii="Times New Roman" w:hAnsi="Times New Roman" w:eastAsia="宋体"/>
+          <w:rFonts w:ascii="Arial" w:hAnsi="Arial" w:eastAsia="PingFang SC"/>
           <w:b w:val="0"/>
           <w:i/>
           <w:sz w:val="24"/>
@@ -3792,7 +3792,7 @@
       </w:r>
       <w:r>
         <w:rPr>
-          <w:rFonts w:ascii="Times New Roman" w:hAnsi="Times New Roman" w:eastAsia="宋体"/>
+          <w:rFonts w:ascii="Arial" w:hAnsi="Arial" w:eastAsia="PingFang SC"/>
           <w:b w:val="0"/>
           <w:i w:val="0"/>
           <w:sz w:val="24"/>
@@ -3808,7 +3808,7 @@
       </w:pPr>
       <w:r>
         <w:rPr>
-          <w:rFonts w:ascii="Times New Roman" w:hAnsi="Times New Roman" w:eastAsia="仿宋"/>
+          <w:rFonts w:ascii="Arial" w:hAnsi="Arial" w:eastAsia="PingFang SC"/>
           <w:b/>
           <w:i w:val="0"/>
           <w:color w:val="555555"/>
@@ -3818,7 +3818,7 @@
       </w:r>
       <w:r>
         <w:rPr>
-          <w:rFonts w:ascii="Times New Roman" w:hAnsi="Times New Roman" w:eastAsia="仿宋"/>
+          <w:rFonts w:ascii="Arial" w:hAnsi="Arial" w:eastAsia="PingFang SC"/>
           <w:b w:val="0"/>
           <w:i w:val="0"/>
           <w:color w:val="555555"/>
@@ -3835,7 +3835,7 @@
       </w:r>
       <w:r>
         <w:rPr>
-          <w:rFonts w:ascii="Times New Roman" w:hAnsi="Times New Roman" w:eastAsia="仿宋"/>
+          <w:rFonts w:ascii="Arial" w:hAnsi="Arial" w:eastAsia="PingFang SC"/>
           <w:b w:val="0"/>
           <w:i w:val="0"/>
           <w:color w:val="555555"/>
@@ -3852,7 +3852,7 @@
       </w:r>
       <w:r>
         <w:rPr>
-          <w:rFonts w:ascii="Times New Roman" w:hAnsi="Times New Roman" w:eastAsia="仿宋"/>
+          <w:rFonts w:ascii="Arial" w:hAnsi="Arial" w:eastAsia="PingFang SC"/>
           <w:b w:val="0"/>
           <w:i w:val="0"/>
           <w:color w:val="555555"/>
@@ -3869,7 +3869,7 @@
       </w:pPr>
       <w:r>
         <w:rPr>
-          <w:rFonts w:ascii="Times New Roman" w:hAnsi="Times New Roman" w:eastAsia="宋体"/>
+          <w:rFonts w:ascii="Arial" w:hAnsi="Arial" w:eastAsia="PingFang SC"/>
           <w:b w:val="0"/>
           <w:i w:val="0"/>
           <w:sz w:val="24"/>
@@ -3885,7 +3885,7 @@
       </w:pPr>
       <w:r>
         <w:rPr>
-          <w:rFonts w:ascii="Times New Roman" w:hAnsi="Times New Roman" w:eastAsia="宋体"/>
+          <w:rFonts w:ascii="Arial" w:hAnsi="Arial" w:eastAsia="PingFang SC"/>
           <w:b/>
           <w:i w:val="0"/>
           <w:sz w:val="24"/>
@@ -3894,7 +3894,7 @@
       </w:r>
       <w:r>
         <w:rPr>
-          <w:rFonts w:ascii="Times New Roman" w:hAnsi="Times New Roman" w:eastAsia="宋体"/>
+          <w:rFonts w:ascii="Arial" w:hAnsi="Arial" w:eastAsia="PingFang SC"/>
           <w:b/>
           <w:i w:val="0"/>
           <w:sz w:val="24"/>
@@ -3903,7 +3903,7 @@
       </w:r>
       <w:r>
         <w:rPr>
-          <w:rFonts w:ascii="Times New Roman" w:hAnsi="Times New Roman" w:eastAsia="宋体"/>
+          <w:rFonts w:ascii="Arial" w:hAnsi="Arial" w:eastAsia="PingFang SC"/>
           <w:b w:val="0"/>
           <w:i w:val="0"/>
           <w:sz w:val="24"/>
@@ -3919,7 +3919,7 @@
       </w:r>
       <w:r>
         <w:rPr>
-          <w:rFonts w:ascii="Times New Roman" w:hAnsi="Times New Roman" w:eastAsia="宋体"/>
+          <w:rFonts w:ascii="Arial" w:hAnsi="Arial" w:eastAsia="PingFang SC"/>
           <w:b w:val="0"/>
           <w:i w:val="0"/>
           <w:sz w:val="24"/>
@@ -3935,7 +3935,7 @@
       </w:pPr>
       <w:r>
         <w:rPr>
-          <w:rFonts w:ascii="Times New Roman" w:hAnsi="Times New Roman" w:eastAsia="宋体"/>
+          <w:rFonts w:ascii="Arial" w:hAnsi="Arial" w:eastAsia="PingFang SC"/>
           <w:b/>
           <w:i w:val="0"/>
           <w:sz w:val="24"/>
@@ -3944,7 +3944,7 @@
       </w:r>
       <w:r>
         <w:rPr>
-          <w:rFonts w:ascii="Times New Roman" w:hAnsi="Times New Roman" w:eastAsia="宋体"/>
+          <w:rFonts w:ascii="Arial" w:hAnsi="Arial" w:eastAsia="PingFang SC"/>
           <w:b/>
           <w:i w:val="0"/>
           <w:sz w:val="24"/>
@@ -3953,7 +3953,7 @@
       </w:r>
       <w:r>
         <w:rPr>
-          <w:rFonts w:ascii="Times New Roman" w:hAnsi="Times New Roman" w:eastAsia="宋体"/>
+          <w:rFonts w:ascii="Arial" w:hAnsi="Arial" w:eastAsia="PingFang SC"/>
           <w:b w:val="0"/>
           <w:i w:val="0"/>
           <w:sz w:val="24"/>
@@ -3969,7 +3969,7 @@
       </w:pPr>
       <w:r>
         <w:rPr>
-          <w:rFonts w:ascii="Times New Roman" w:hAnsi="Times New Roman" w:eastAsia="宋体"/>
+          <w:rFonts w:ascii="Arial" w:hAnsi="Arial" w:eastAsia="PingFang SC"/>
           <w:b w:val="0"/>
           <w:i w:val="0"/>
           <w:sz w:val="24"/>
@@ -3978,7 +3978,7 @@
       </w:r>
       <w:r>
         <w:rPr>
-          <w:rFonts w:ascii="Times New Roman" w:hAnsi="Times New Roman" w:eastAsia="宋体"/>
+          <w:rFonts w:ascii="Arial" w:hAnsi="Arial" w:eastAsia="PingFang SC"/>
           <w:b w:val="0"/>
           <w:i w:val="0"/>
           <w:sz w:val="24"/>
@@ -3994,7 +3994,7 @@
       </w:pPr>
       <w:r>
         <w:rPr>
-          <w:rFonts w:ascii="Times New Roman" w:hAnsi="Times New Roman" w:eastAsia="宋体"/>
+          <w:rFonts w:ascii="Arial" w:hAnsi="Arial" w:eastAsia="PingFang SC"/>
           <w:b w:val="0"/>
           <w:i w:val="0"/>
           <w:sz w:val="24"/>
@@ -4003,7 +4003,7 @@
       </w:r>
       <w:r>
         <w:rPr>
-          <w:rFonts w:ascii="Times New Roman" w:hAnsi="Times New Roman" w:eastAsia="宋体"/>
+          <w:rFonts w:ascii="Arial" w:hAnsi="Arial" w:eastAsia="PingFang SC"/>
           <w:b w:val="0"/>
           <w:i w:val="0"/>
           <w:sz w:val="24"/>
@@ -4019,7 +4019,7 @@
       </w:pPr>
       <w:r>
         <w:rPr>
-          <w:rFonts w:ascii="Times New Roman" w:hAnsi="Times New Roman" w:eastAsia="宋体"/>
+          <w:rFonts w:ascii="Arial" w:hAnsi="Arial" w:eastAsia="PingFang SC"/>
           <w:b w:val="0"/>
           <w:i w:val="0"/>
           <w:sz w:val="24"/>
@@ -4028,7 +4028,7 @@
       </w:r>
       <w:r>
         <w:rPr>
-          <w:rFonts w:ascii="Times New Roman" w:hAnsi="Times New Roman" w:eastAsia="宋体"/>
+          <w:rFonts w:ascii="Arial" w:hAnsi="Arial" w:eastAsia="PingFang SC"/>
           <w:b w:val="0"/>
           <w:i w:val="0"/>
           <w:sz w:val="24"/>
@@ -4044,7 +4044,7 @@
       </w:pPr>
       <w:r>
         <w:rPr>
-          <w:rFonts w:ascii="Times New Roman" w:hAnsi="Times New Roman" w:eastAsia="宋体"/>
+          <w:rFonts w:ascii="Arial" w:hAnsi="Arial" w:eastAsia="PingFang SC"/>
           <w:b w:val="0"/>
           <w:i w:val="0"/>
           <w:sz w:val="24"/>
@@ -4053,7 +4053,7 @@
       </w:r>
       <w:r>
         <w:rPr>
-          <w:rFonts w:ascii="Times New Roman" w:hAnsi="Times New Roman" w:eastAsia="宋体"/>
+          <w:rFonts w:ascii="Arial" w:hAnsi="Arial" w:eastAsia="PingFang SC"/>
           <w:b w:val="0"/>
           <w:i w:val="0"/>
           <w:sz w:val="24"/>
@@ -4069,7 +4069,7 @@
       </w:pPr>
       <w:r>
         <w:rPr>
-          <w:rFonts w:ascii="Times New Roman" w:hAnsi="Times New Roman" w:eastAsia="宋体"/>
+          <w:rFonts w:ascii="Arial" w:hAnsi="Arial" w:eastAsia="PingFang SC"/>
           <w:b/>
           <w:i w:val="0"/>
           <w:sz w:val="24"/>
@@ -4078,7 +4078,7 @@
       </w:r>
       <w:r>
         <w:rPr>
-          <w:rFonts w:ascii="Times New Roman" w:hAnsi="Times New Roman" w:eastAsia="宋体"/>
+          <w:rFonts w:ascii="Arial" w:hAnsi="Arial" w:eastAsia="PingFang SC"/>
           <w:b/>
           <w:i w:val="0"/>
           <w:sz w:val="24"/>
@@ -4087,7 +4087,7 @@
       </w:r>
       <w:r>
         <w:rPr>
-          <w:rFonts w:ascii="Times New Roman" w:hAnsi="Times New Roman" w:eastAsia="宋体"/>
+          <w:rFonts w:ascii="Arial" w:hAnsi="Arial" w:eastAsia="PingFang SC"/>
           <w:b w:val="0"/>
           <w:i w:val="0"/>
           <w:sz w:val="24"/>
@@ -4103,7 +4103,7 @@
       </w:pPr>
       <w:r>
         <w:rPr>
-          <w:rFonts w:ascii="Times New Roman" w:hAnsi="Times New Roman" w:eastAsia="宋体"/>
+          <w:rFonts w:ascii="Arial" w:hAnsi="Arial" w:eastAsia="PingFang SC"/>
           <w:b w:val="0"/>
           <w:i w:val="0"/>
           <w:sz w:val="24"/>
@@ -4112,7 +4112,7 @@
       </w:r>
       <w:r>
         <w:rPr>
-          <w:rFonts w:ascii="Times New Roman" w:hAnsi="Times New Roman" w:eastAsia="宋体"/>
+          <w:rFonts w:ascii="Arial" w:hAnsi="Arial" w:eastAsia="PingFang SC"/>
           <w:b w:val="0"/>
           <w:i w:val="0"/>
           <w:sz w:val="24"/>
@@ -4128,7 +4128,7 @@
       </w:pPr>
       <w:r>
         <w:rPr>
-          <w:rFonts w:ascii="Times New Roman" w:hAnsi="Times New Roman" w:eastAsia="宋体"/>
+          <w:rFonts w:ascii="Arial" w:hAnsi="Arial" w:eastAsia="PingFang SC"/>
           <w:b w:val="0"/>
           <w:i w:val="0"/>
           <w:sz w:val="24"/>
@@ -4137,7 +4137,7 @@
       </w:r>
       <w:r>
         <w:rPr>
-          <w:rFonts w:ascii="Times New Roman" w:hAnsi="Times New Roman" w:eastAsia="宋体"/>
+          <w:rFonts w:ascii="Arial" w:hAnsi="Arial" w:eastAsia="PingFang SC"/>
           <w:b w:val="0"/>
           <w:i w:val="0"/>
           <w:sz w:val="24"/>
@@ -4153,7 +4153,7 @@
       </w:pPr>
       <w:r>
         <w:rPr>
-          <w:rFonts w:ascii="Times New Roman" w:hAnsi="Times New Roman" w:eastAsia="宋体"/>
+          <w:rFonts w:ascii="Arial" w:hAnsi="Arial" w:eastAsia="PingFang SC"/>
           <w:b w:val="0"/>
           <w:i w:val="0"/>
           <w:sz w:val="24"/>
@@ -4162,7 +4162,7 @@
       </w:r>
       <w:r>
         <w:rPr>
-          <w:rFonts w:ascii="Times New Roman" w:hAnsi="Times New Roman" w:eastAsia="宋体"/>
+          <w:rFonts w:ascii="Arial" w:hAnsi="Arial" w:eastAsia="PingFang SC"/>
           <w:b w:val="0"/>
           <w:i w:val="0"/>
           <w:sz w:val="24"/>
@@ -4178,7 +4178,7 @@
       </w:pPr>
       <w:r>
         <w:rPr>
-          <w:rFonts w:ascii="Times New Roman" w:hAnsi="Times New Roman" w:eastAsia="宋体"/>
+          <w:rFonts w:ascii="Arial" w:hAnsi="Arial" w:eastAsia="PingFang SC"/>
           <w:b/>
           <w:i w:val="0"/>
           <w:sz w:val="24"/>
@@ -4187,7 +4187,7 @@
       </w:r>
       <w:r>
         <w:rPr>
-          <w:rFonts w:ascii="Times New Roman" w:hAnsi="Times New Roman" w:eastAsia="宋体"/>
+          <w:rFonts w:ascii="Arial" w:hAnsi="Arial" w:eastAsia="PingFang SC"/>
           <w:b/>
           <w:i w:val="0"/>
           <w:sz w:val="24"/>
@@ -4196,7 +4196,7 @@
       </w:r>
       <w:r>
         <w:rPr>
-          <w:rFonts w:ascii="Times New Roman" w:hAnsi="Times New Roman" w:eastAsia="宋体"/>
+          <w:rFonts w:ascii="Arial" w:hAnsi="Arial" w:eastAsia="PingFang SC"/>
           <w:b w:val="0"/>
           <w:i w:val="0"/>
           <w:sz w:val="24"/>
@@ -4212,7 +4212,7 @@
       </w:pPr>
       <w:r>
         <w:rPr>
-          <w:rFonts w:ascii="Times New Roman" w:hAnsi="Times New Roman" w:eastAsia="宋体"/>
+          <w:rFonts w:ascii="Arial" w:hAnsi="Arial" w:eastAsia="PingFang SC"/>
           <w:b w:val="0"/>
           <w:i w:val="0"/>
           <w:sz w:val="24"/>
@@ -4221,7 +4221,7 @@
       </w:r>
       <w:r>
         <w:rPr>
-          <w:rFonts w:ascii="Times New Roman" w:hAnsi="Times New Roman" w:eastAsia="宋体"/>
+          <w:rFonts w:ascii="Arial" w:hAnsi="Arial" w:eastAsia="PingFang SC"/>
           <w:b w:val="0"/>
           <w:i w:val="0"/>
           <w:sz w:val="24"/>
@@ -4237,7 +4237,7 @@
       </w:r>
       <w:r>
         <w:rPr>
-          <w:rFonts w:ascii="Times New Roman" w:hAnsi="Times New Roman" w:eastAsia="宋体"/>
+          <w:rFonts w:ascii="Arial" w:hAnsi="Arial" w:eastAsia="PingFang SC"/>
           <w:b w:val="0"/>
           <w:i w:val="0"/>
           <w:sz w:val="24"/>
@@ -4253,7 +4253,7 @@
       </w:pPr>
       <w:r>
         <w:rPr>
-          <w:rFonts w:ascii="Times New Roman" w:hAnsi="Times New Roman" w:eastAsia="宋体"/>
+          <w:rFonts w:ascii="Arial" w:hAnsi="Arial" w:eastAsia="PingFang SC"/>
           <w:b w:val="0"/>
           <w:i w:val="0"/>
           <w:sz w:val="24"/>
@@ -4262,7 +4262,7 @@
       </w:r>
       <w:r>
         <w:rPr>
-          <w:rFonts w:ascii="Times New Roman" w:hAnsi="Times New Roman" w:eastAsia="宋体"/>
+          <w:rFonts w:ascii="Arial" w:hAnsi="Arial" w:eastAsia="PingFang SC"/>
           <w:b w:val="0"/>
           <w:i w:val="0"/>
           <w:sz w:val="24"/>
@@ -4289,7 +4289,7 @@
       </w:pPr>
       <w:r>
         <w:rPr>
-          <w:rFonts w:ascii="Arial" w:hAnsi="Arial" w:eastAsia="黑体"/>
+          <w:rFonts w:ascii="Arial" w:hAnsi="Arial" w:eastAsia="PingFang SC"/>
           <w:b/>
           <w:i w:val="0"/>
           <w:color w:val="000000"/>
@@ -4305,7 +4305,7 @@
       </w:pPr>
       <w:r>
         <w:rPr>
-          <w:rFonts w:ascii="Arial" w:hAnsi="Arial" w:eastAsia="黑体"/>
+          <w:rFonts w:ascii="Arial" w:hAnsi="Arial" w:eastAsia="PingFang SC"/>
           <w:b/>
           <w:i w:val="0"/>
           <w:color w:val="333333"/>
@@ -4322,7 +4322,7 @@
       </w:pPr>
       <w:r>
         <w:rPr>
-          <w:rFonts w:ascii="Times New Roman" w:hAnsi="Times New Roman" w:eastAsia="宋体"/>
+          <w:rFonts w:ascii="Arial" w:hAnsi="Arial" w:eastAsia="PingFang SC"/>
           <w:b w:val="0"/>
           <w:i w:val="0"/>
           <w:sz w:val="24"/>
@@ -4338,7 +4338,7 @@
       </w:pPr>
       <w:r>
         <w:rPr>
-          <w:rFonts w:ascii="Times New Roman" w:hAnsi="Times New Roman" w:eastAsia="宋体"/>
+          <w:rFonts w:ascii="Arial" w:hAnsi="Arial" w:eastAsia="PingFang SC"/>
           <w:b w:val="0"/>
           <w:i w:val="0"/>
           <w:sz w:val="24"/>
@@ -4353,7 +4353,7 @@
       </w:pPr>
       <w:r>
         <w:rPr>
-          <w:rFonts w:ascii="Arial" w:hAnsi="Arial" w:eastAsia="黑体"/>
+          <w:rFonts w:ascii="Arial" w:hAnsi="Arial" w:eastAsia="PingFang SC"/>
           <w:b/>
           <w:i w:val="0"/>
           <w:color w:val="333333"/>
@@ -4383,7 +4383,7 @@
       </w:pPr>
       <w:r>
         <w:rPr>
-          <w:rFonts w:ascii="Arial" w:hAnsi="Arial" w:eastAsia="黑体"/>
+          <w:rFonts w:ascii="Arial" w:hAnsi="Arial" w:eastAsia="PingFang SC"/>
           <w:b/>
           <w:i w:val="0"/>
           <w:color w:val="333333"/>
@@ -4400,7 +4400,7 @@
       </w:pPr>
       <w:r>
         <w:rPr>
-          <w:rFonts w:ascii="Times New Roman" w:hAnsi="Times New Roman" w:eastAsia="宋体"/>
+          <w:rFonts w:ascii="Arial" w:hAnsi="Arial" w:eastAsia="PingFang SC"/>
           <w:b w:val="0"/>
           <w:i w:val="0"/>
           <w:sz w:val="24"/>
@@ -4416,7 +4416,7 @@
       </w:r>
       <w:r>
         <w:rPr>
-          <w:rFonts w:ascii="Times New Roman" w:hAnsi="Times New Roman" w:eastAsia="宋体"/>
+          <w:rFonts w:ascii="Arial" w:hAnsi="Arial" w:eastAsia="PingFang SC"/>
           <w:b w:val="0"/>
           <w:i w:val="0"/>
           <w:sz w:val="24"/>
@@ -4432,7 +4432,7 @@
       </w:r>
       <w:r>
         <w:rPr>
-          <w:rFonts w:ascii="Times New Roman" w:hAnsi="Times New Roman" w:eastAsia="宋体"/>
+          <w:rFonts w:ascii="Arial" w:hAnsi="Arial" w:eastAsia="PingFang SC"/>
           <w:b w:val="0"/>
           <w:i w:val="0"/>
           <w:sz w:val="24"/>
@@ -4448,7 +4448,7 @@
       </w:r>
       <w:r>
         <w:rPr>
-          <w:rFonts w:ascii="Times New Roman" w:hAnsi="Times New Roman" w:eastAsia="宋体"/>
+          <w:rFonts w:ascii="Arial" w:hAnsi="Arial" w:eastAsia="PingFang SC"/>
           <w:b w:val="0"/>
           <w:i w:val="0"/>
           <w:sz w:val="24"/>
@@ -4476,7 +4476,7 @@
       </w:pPr>
       <w:r>
         <w:rPr>
-          <w:rFonts w:ascii="Times New Roman" w:hAnsi="Times New Roman" w:eastAsia="宋体"/>
+          <w:rFonts w:ascii="Arial" w:hAnsi="Arial" w:eastAsia="PingFang SC"/>
           <w:b w:val="0"/>
           <w:i/>
           <w:sz w:val="24"/>

</xml_diff>